<commit_message>
Lots of minor changes...
</commit_message>
<xml_diff>
--- a/Hot Pursuit/Hot Pursuit Description.docx
+++ b/Hot Pursuit/Hot Pursuit Description.docx
@@ -1,6 +1,6 @@
 
 <file path=word/document.xml><?xml version="1.0" encoding="utf-8"?>
-<w:document xmlns:wpc="http://schemas.microsoft.com/office/word/2010/wordprocessingCanvas" xmlns:cx="http://schemas.microsoft.com/office/drawing/2014/chartex" xmlns:cx1="http://schemas.microsoft.com/office/drawing/2015/9/8/chartex" xmlns:cx2="http://schemas.microsoft.com/office/drawing/2015/10/21/chartex" xmlns:cx3="http://schemas.microsoft.com/office/drawing/2016/5/9/chartex" xmlns:cx4="http://schemas.microsoft.com/office/drawing/2016/5/10/chartex" xmlns:cx5="http://schemas.microsoft.com/office/drawing/2016/5/11/chartex" xmlns:cx6="http://schemas.microsoft.com/office/drawing/2016/5/12/chartex" xmlns:cx7="http://schemas.microsoft.com/office/drawing/2016/5/13/chartex" xmlns:cx8="http://schemas.microsoft.com/office/drawing/2016/5/14/chartex" xmlns:mc="http://schemas.openxmlformats.org/markup-compatibility/2006" xmlns:aink="http://schemas.microsoft.com/office/drawing/2016/ink" xmlns:am3d="http://schemas.microsoft.com/office/drawing/2017/model3d" xmlns:o="urn:schemas-microsoft-com:office:office" xmlns:oel="http://schemas.microsoft.com/office/2019/extlst" xmlns:r="http://schemas.openxmlformats.org/officeDocument/2006/relationships" xmlns:m="http://schemas.openxmlformats.org/officeDocument/2006/math" xmlns:v="urn:schemas-microsoft-com:vml" xmlns:wp14="http://schemas.microsoft.com/office/word/2010/wordprocessingDrawing" xmlns:wp="http://schemas.openxmlformats.org/drawingml/2006/wordprocessingDrawing" xmlns:w10="urn:schemas-microsoft-com:office:word" xmlns:w="http://schemas.openxmlformats.org/wordprocessingml/2006/main" xmlns:w14="http://schemas.microsoft.com/office/word/2010/wordml" xmlns:w15="http://schemas.microsoft.com/office/word/2012/wordml" xmlns:w16cex="http://schemas.microsoft.com/office/word/2018/wordml/cex" xmlns:w16cid="http://schemas.microsoft.com/office/word/2016/wordml/cid" xmlns:w16="http://schemas.microsoft.com/office/word/2018/wordml" xmlns:w16sdtdh="http://schemas.microsoft.com/office/word/2020/wordml/sdtdatahash" xmlns:w16se="http://schemas.microsoft.com/office/word/2015/wordml/symex" xmlns:wpg="http://schemas.microsoft.com/office/word/2010/wordprocessingGroup" xmlns:wpi="http://schemas.microsoft.com/office/word/2010/wordprocessingInk" xmlns:wne="http://schemas.microsoft.com/office/word/2006/wordml" xmlns:wps="http://schemas.microsoft.com/office/word/2010/wordprocessingShape" mc:Ignorable="w14 w15 w16se w16cid w16 w16cex w16sdtdh wp14">
+<w:document xmlns:wpc="http://schemas.microsoft.com/office/word/2010/wordprocessingCanvas" xmlns:cx="http://schemas.microsoft.com/office/drawing/2014/chartex" xmlns:cx1="http://schemas.microsoft.com/office/drawing/2015/9/8/chartex" xmlns:cx2="http://schemas.microsoft.com/office/drawing/2015/10/21/chartex" xmlns:cx3="http://schemas.microsoft.com/office/drawing/2016/5/9/chartex" xmlns:cx4="http://schemas.microsoft.com/office/drawing/2016/5/10/chartex" xmlns:cx5="http://schemas.microsoft.com/office/drawing/2016/5/11/chartex" xmlns:cx6="http://schemas.microsoft.com/office/drawing/2016/5/12/chartex" xmlns:cx7="http://schemas.microsoft.com/office/drawing/2016/5/13/chartex" xmlns:cx8="http://schemas.microsoft.com/office/drawing/2016/5/14/chartex" xmlns:mc="http://schemas.openxmlformats.org/markup-compatibility/2006" xmlns:aink="http://schemas.microsoft.com/office/drawing/2016/ink" xmlns:am3d="http://schemas.microsoft.com/office/drawing/2017/model3d" xmlns:o="urn:schemas-microsoft-com:office:office" xmlns:oel="http://schemas.microsoft.com/office/2019/extlst" xmlns:r="http://schemas.openxmlformats.org/officeDocument/2006/relationships" xmlns:m="http://schemas.openxmlformats.org/officeDocument/2006/math" xmlns:v="urn:schemas-microsoft-com:vml" xmlns:wp14="http://schemas.microsoft.com/office/word/2010/wordprocessingDrawing" xmlns:wp="http://schemas.openxmlformats.org/drawingml/2006/wordprocessingDrawing" xmlns:w10="urn:schemas-microsoft-com:office:word" xmlns:w="http://schemas.openxmlformats.org/wordprocessingml/2006/main" xmlns:w14="http://schemas.microsoft.com/office/word/2010/wordml" xmlns:w15="http://schemas.microsoft.com/office/word/2012/wordml" xmlns:w16cex="http://schemas.microsoft.com/office/word/2018/wordml/cex" xmlns:w16cid="http://schemas.microsoft.com/office/word/2016/wordml/cid" xmlns:w16="http://schemas.microsoft.com/office/word/2018/wordml" xmlns:w16du="http://schemas.microsoft.com/office/word/2023/wordml/word16du" xmlns:w16sdtdh="http://schemas.microsoft.com/office/word/2020/wordml/sdtdatahash" xmlns:w16sdtfl="http://schemas.microsoft.com/office/word/2024/wordml/sdtformatlock" xmlns:w16se="http://schemas.microsoft.com/office/word/2015/wordml/symex" xmlns:wpg="http://schemas.microsoft.com/office/word/2010/wordprocessingGroup" xmlns:wpi="http://schemas.microsoft.com/office/word/2010/wordprocessingInk" xmlns:wne="http://schemas.microsoft.com/office/word/2006/wordml" xmlns:wps="http://schemas.microsoft.com/office/word/2010/wordprocessingShape" mc:Ignorable="w14 w15 w16se w16cid w16 w16cex w16sdtdh w16sdtfl w16du wp14">
   <w:body>
     <w:p>
       <w:pPr>
@@ -100,27 +100,25 @@
           <w:sz w:val="20"/>
           <w:szCs w:val="20"/>
         </w:rPr>
-        <w:t xml:space="preserve">I’m thinking we should have a category called “101 Fun Things To Do With </w:t>
-      </w:r>
-      <w:proofErr w:type="spellStart"/>
-      <w:r>
-        <w:rPr>
-          <w:rFonts w:ascii="Arial" w:hAnsi="Arial" w:cs="Arial"/>
-          <w:bCs/>
-          <w:sz w:val="20"/>
-          <w:szCs w:val="20"/>
-        </w:rPr>
-        <w:t>TheSky</w:t>
-      </w:r>
-      <w:proofErr w:type="spellEnd"/>
-      <w:r>
-        <w:rPr>
-          <w:rFonts w:ascii="Arial" w:hAnsi="Arial" w:cs="Arial"/>
-          <w:bCs/>
-          <w:sz w:val="20"/>
-          <w:szCs w:val="20"/>
-        </w:rPr>
-        <w:t>.  This little application mostly falls under that moniker.  As most of us know, a couple of hundred good sized rocks are discovered whizzing by the earth every year.  Today, most of these Near Earth Objects (NEO’s) are identified by well-funded, organized projects, but a few are still by amateurs, here and there.  However once spotted, each reported fly-by goes through a phase where it must be confirmed and a precise orbit determined through multiple, independent measurements.  During its time in purgatory, a NEO is listed on a NASA website called “Scout”.  Once confirmed (by somebody, at some point, I guess) the object moves off of Scout and into the IAU Minor Planet Center database.  But, for a time, one has a chance for a look at the equivalent of an astronomical UFO.  That’s where this little app comes in.</w:t>
+        <w:t xml:space="preserve">Today, most of these Near Earth Objects (NEO’s) are identified by well-funded, organized projects, but a few are still by amateurs, here and there.  However once spotted, each reported fly-by goes through a phase where it must be confirmed and a precise orbit determined through multiple, independent measurements.  </w:t>
+      </w:r>
+      <w:r>
+        <w:rPr>
+          <w:rFonts w:ascii="Arial" w:hAnsi="Arial" w:cs="Arial"/>
+          <w:bCs/>
+          <w:sz w:val="20"/>
+          <w:szCs w:val="20"/>
+        </w:rPr>
+        <w:t>Prior to confirmation</w:t>
+      </w:r>
+      <w:r>
+        <w:rPr>
+          <w:rFonts w:ascii="Arial" w:hAnsi="Arial" w:cs="Arial"/>
+          <w:bCs/>
+          <w:sz w:val="20"/>
+          <w:szCs w:val="20"/>
+        </w:rPr>
+        <w:t>, a NEO is listed on a NASA website called “Scout”.  Once confirmed the object moves off of Scout and into the IAU Minor Planet Center database.  But, for a time, one has a chance for a look at the equivalent of an astronomical UFO.  That’s where this little app comes in.</w:t>
       </w:r>
     </w:p>
     <w:p>
@@ -159,7 +157,6 @@
         </w:rPr>
         <w:t xml:space="preserve"> with another </w:t>
       </w:r>
-      <w:proofErr w:type="spellStart"/>
       <w:r>
         <w:rPr>
           <w:rFonts w:ascii="Arial" w:hAnsi="Arial" w:cs="Arial"/>
@@ -169,15 +166,14 @@
         </w:rPr>
         <w:t>TSXToolKit</w:t>
       </w:r>
-      <w:proofErr w:type="spellEnd"/>
-      <w:r>
-        <w:rPr>
-          <w:rFonts w:ascii="Arial" w:hAnsi="Arial" w:cs="Arial"/>
-          <w:bCs/>
-          <w:sz w:val="20"/>
-          <w:szCs w:val="20"/>
-        </w:rPr>
-        <w:t xml:space="preserve"> app called Transient Search.  Transient Search enables a user to load the current Scout unconfirmed object list into TSX as a SDB catalog in about three clicks.  (This too falls under the category of “101 Fun Things...”).  Once loaded a user can pick a target and run Hot Pursuit whose sole job is to keep the mount pointed at that target.  The reason it’s tricky is that these NEO’s move across the sky at a pace and direction somewhere between a satellite and a planet.  At any given time, their apparent movement is anywhere between less than one to over a couple of </w:t>
+      <w:r>
+        <w:rPr>
+          <w:rFonts w:ascii="Arial" w:hAnsi="Arial" w:cs="Arial"/>
+          <w:bCs/>
+          <w:sz w:val="20"/>
+          <w:szCs w:val="20"/>
+        </w:rPr>
+        <w:t xml:space="preserve"> app called Transient Search.  Transient Search enables a user to load the current Scout unconfirmed object list into TSX as a SDB Once loaded a user can pick a target and run Hot Pursuit whose sole job is to keep the mount pointed at that target.  The reason it’s tricky is that NEO’s move across the sky at a pace and direction somewhere between a satellite and a planet.  At any given time, their apparent movement is anywhere between less than one to over a couple of </w:t>
       </w:r>
       <w:r>
         <w:rPr>
@@ -277,17 +273,7 @@
           <w:sz w:val="20"/>
           <w:szCs w:val="20"/>
         </w:rPr>
-        <w:t xml:space="preserve"> for the imager’s site.  That calculation is passed to </w:t>
-      </w:r>
-      <w:proofErr w:type="spellStart"/>
-      <w:r>
-        <w:rPr>
-          <w:rFonts w:ascii="Arial" w:hAnsi="Arial" w:cs="Arial"/>
-          <w:bCs/>
-          <w:sz w:val="20"/>
-          <w:szCs w:val="20"/>
-        </w:rPr>
-        <w:t>T</w:t>
+        <w:t xml:space="preserve"> for the imager’s site.  That calculation is passed to T</w:t>
       </w:r>
       <w:r>
         <w:rPr>
@@ -298,27 +284,15 @@
         </w:rPr>
         <w:t>heSky</w:t>
       </w:r>
-      <w:proofErr w:type="spellEnd"/>
-      <w:r>
-        <w:rPr>
-          <w:rFonts w:ascii="Arial" w:hAnsi="Arial" w:cs="Arial"/>
-          <w:bCs/>
-          <w:sz w:val="20"/>
-          <w:szCs w:val="20"/>
-        </w:rPr>
-        <w:t xml:space="preserve"> in the form of real-time Tracking Speed changes over the course of the session.  The user is free to use whatever imaging technique they prefer: long exposure, stacking, live stacking, video, </w:t>
-      </w:r>
-      <w:proofErr w:type="spellStart"/>
-      <w:r>
-        <w:rPr>
-          <w:rFonts w:ascii="Arial" w:hAnsi="Arial" w:cs="Arial"/>
-          <w:bCs/>
-          <w:sz w:val="20"/>
-          <w:szCs w:val="20"/>
-        </w:rPr>
-        <w:t>etc</w:t>
-      </w:r>
-      <w:proofErr w:type="spellEnd"/>
+      <w:r>
+        <w:rPr>
+          <w:rFonts w:ascii="Arial" w:hAnsi="Arial" w:cs="Arial"/>
+          <w:bCs/>
+          <w:sz w:val="20"/>
+          <w:szCs w:val="20"/>
+        </w:rPr>
+        <w:t xml:space="preserve"> in the form of real-time Tracking Speed changes over the course of the session.  The user is free to use whatever imaging technique they prefer: long exposure, stacking, live stacking, video, etc</w:t>
+      </w:r>
       <w:r>
         <w:rPr>
           <w:rFonts w:ascii="Arial" w:hAnsi="Arial" w:cs="Arial"/>
@@ -425,25 +399,16 @@
           <w:sz w:val="20"/>
           <w:szCs w:val="20"/>
         </w:rPr>
-        <w:t>controller just</w:t>
-      </w:r>
-      <w:r>
-        <w:rPr>
-          <w:rFonts w:ascii="Arial" w:hAnsi="Arial" w:cs="Arial"/>
-          <w:bCs/>
-          <w:sz w:val="20"/>
-          <w:szCs w:val="20"/>
-        </w:rPr>
-        <w:t xml:space="preserve"> for </w:t>
-      </w:r>
-      <w:r>
-        <w:rPr>
-          <w:rFonts w:ascii="Arial" w:hAnsi="Arial" w:cs="Arial"/>
-          <w:bCs/>
-          <w:sz w:val="20"/>
-          <w:szCs w:val="20"/>
-        </w:rPr>
-        <w:t>the inherently lazy like myself.</w:t>
+        <w:t>controller</w:t>
+      </w:r>
+      <w:r>
+        <w:rPr>
+          <w:rFonts w:ascii="Arial" w:hAnsi="Arial" w:cs="Arial"/>
+          <w:bCs/>
+          <w:sz w:val="20"/>
+          <w:szCs w:val="20"/>
+        </w:rPr>
+        <w:t>.</w:t>
       </w:r>
     </w:p>
     <w:p>
@@ -715,202 +680,142 @@
           <w:sz w:val="20"/>
           <w:szCs w:val="20"/>
         </w:rPr>
+        <w:t xml:space="preserve"> TheSky to select a target from the </w:t>
+      </w:r>
+      <w:r>
+        <w:rPr>
+          <w:rFonts w:ascii="Arial" w:hAnsi="Arial" w:cs="Arial"/>
+          <w:bCs/>
+          <w:sz w:val="20"/>
+          <w:szCs w:val="20"/>
+        </w:rPr>
+        <w:t xml:space="preserve">Small Solar System Body database, or </w:t>
+      </w:r>
+      <w:r>
+        <w:rPr>
+          <w:rFonts w:ascii="Arial" w:hAnsi="Arial" w:cs="Arial"/>
+          <w:bCs/>
+          <w:sz w:val="20"/>
+          <w:szCs w:val="20"/>
+        </w:rPr>
+        <w:t xml:space="preserve">just </w:t>
+      </w:r>
+      <w:r>
+        <w:rPr>
+          <w:rFonts w:ascii="Arial" w:hAnsi="Arial" w:cs="Arial"/>
+          <w:bCs/>
+          <w:sz w:val="20"/>
+          <w:szCs w:val="20"/>
+        </w:rPr>
+        <w:t xml:space="preserve">enter a </w:t>
+      </w:r>
+      <w:r>
+        <w:rPr>
+          <w:rFonts w:ascii="Arial" w:hAnsi="Arial" w:cs="Arial"/>
+          <w:bCs/>
+          <w:sz w:val="20"/>
+          <w:szCs w:val="20"/>
+        </w:rPr>
+        <w:t xml:space="preserve">name designation in the Target field to select.  </w:t>
+      </w:r>
+      <w:r>
+        <w:rPr>
+          <w:rFonts w:ascii="Arial" w:hAnsi="Arial" w:cs="Arial"/>
+          <w:bCs/>
+          <w:sz w:val="20"/>
+          <w:szCs w:val="20"/>
+        </w:rPr>
+        <w:t>For instance, if you wanted to image the James Webb, simply enter “JWST” in the target field</w:t>
+      </w:r>
+      <w:r>
+        <w:rPr>
+          <w:rFonts w:ascii="Arial" w:hAnsi="Arial" w:cs="Arial"/>
+          <w:bCs/>
+          <w:sz w:val="20"/>
+          <w:szCs w:val="20"/>
+        </w:rPr>
+        <w:t xml:space="preserve"> and</w:t>
+      </w:r>
+      <w:r>
+        <w:rPr>
+          <w:rFonts w:ascii="Arial" w:hAnsi="Arial" w:cs="Arial"/>
+          <w:bCs/>
+          <w:sz w:val="20"/>
+          <w:szCs w:val="20"/>
+        </w:rPr>
+        <w:t xml:space="preserve"> hit “Horizons” </w:t>
+      </w:r>
+      <w:r>
+        <w:rPr>
+          <w:rFonts w:ascii="Arial" w:hAnsi="Arial" w:cs="Arial"/>
+          <w:bCs/>
+          <w:sz w:val="20"/>
+          <w:szCs w:val="20"/>
+        </w:rPr>
+        <w:t xml:space="preserve">to load and </w:t>
+      </w:r>
+      <w:r>
+        <w:rPr>
+          <w:rFonts w:ascii="Arial" w:hAnsi="Arial" w:cs="Arial"/>
+          <w:bCs/>
+          <w:sz w:val="20"/>
+          <w:szCs w:val="20"/>
+        </w:rPr>
+        <w:t>initiate TheSky tracking.</w:t>
+      </w:r>
+      <w:r>
+        <w:rPr>
+          <w:rFonts w:ascii="Arial" w:hAnsi="Arial" w:cs="Arial"/>
+          <w:bCs/>
+          <w:sz w:val="20"/>
+          <w:szCs w:val="20"/>
+        </w:rPr>
+        <w:t xml:space="preserve">  Naming conventions seem to differ between the two </w:t>
+      </w:r>
+      <w:r>
+        <w:rPr>
+          <w:rFonts w:ascii="Arial" w:hAnsi="Arial" w:cs="Arial"/>
+          <w:bCs/>
+          <w:sz w:val="20"/>
+          <w:szCs w:val="20"/>
+        </w:rPr>
+        <w:t>databases, so if one doesn’t work, try the other.</w:t>
+      </w:r>
+      <w:r>
+        <w:rPr>
+          <w:rFonts w:ascii="Arial" w:hAnsi="Arial" w:cs="Arial"/>
+          <w:bCs/>
+          <w:sz w:val="20"/>
+          <w:szCs w:val="20"/>
+        </w:rPr>
+        <w:t xml:space="preserve">  For instance, the MPC database seems more amenable to</w:t>
+      </w:r>
+      <w:r>
+        <w:rPr>
+          <w:rFonts w:ascii="Arial" w:hAnsi="Arial" w:cs="Arial"/>
+          <w:bCs/>
+          <w:sz w:val="20"/>
+          <w:szCs w:val="20"/>
+        </w:rPr>
+        <w:t xml:space="preserve"> successful searches on</w:t>
+      </w:r>
+      <w:r>
+        <w:rPr>
+          <w:rFonts w:ascii="Arial" w:hAnsi="Arial" w:cs="Arial"/>
+          <w:bCs/>
+          <w:sz w:val="20"/>
+          <w:szCs w:val="20"/>
+        </w:rPr>
         <w:t xml:space="preserve"> </w:t>
       </w:r>
-      <w:proofErr w:type="spellStart"/>
-      <w:r>
-        <w:rPr>
-          <w:rFonts w:ascii="Arial" w:hAnsi="Arial" w:cs="Arial"/>
-          <w:bCs/>
-          <w:sz w:val="20"/>
-          <w:szCs w:val="20"/>
-        </w:rPr>
-        <w:t>TheSky</w:t>
-      </w:r>
-      <w:proofErr w:type="spellEnd"/>
-      <w:r>
-        <w:rPr>
-          <w:rFonts w:ascii="Arial" w:hAnsi="Arial" w:cs="Arial"/>
-          <w:bCs/>
-          <w:sz w:val="20"/>
-          <w:szCs w:val="20"/>
-        </w:rPr>
-        <w:t xml:space="preserve"> to select a target from the </w:t>
-      </w:r>
-      <w:r>
-        <w:rPr>
-          <w:rFonts w:ascii="Arial" w:hAnsi="Arial" w:cs="Arial"/>
-          <w:bCs/>
-          <w:sz w:val="20"/>
-          <w:szCs w:val="20"/>
-        </w:rPr>
-        <w:t xml:space="preserve">Small Solar System Body database, or </w:t>
-      </w:r>
-      <w:r>
-        <w:rPr>
-          <w:rFonts w:ascii="Arial" w:hAnsi="Arial" w:cs="Arial"/>
-          <w:bCs/>
-          <w:sz w:val="20"/>
-          <w:szCs w:val="20"/>
-        </w:rPr>
-        <w:t xml:space="preserve">just </w:t>
-      </w:r>
-      <w:r>
-        <w:rPr>
-          <w:rFonts w:ascii="Arial" w:hAnsi="Arial" w:cs="Arial"/>
-          <w:bCs/>
-          <w:sz w:val="20"/>
-          <w:szCs w:val="20"/>
-        </w:rPr>
-        <w:t xml:space="preserve">enter a </w:t>
-      </w:r>
-      <w:r>
-        <w:rPr>
-          <w:rFonts w:ascii="Arial" w:hAnsi="Arial" w:cs="Arial"/>
-          <w:bCs/>
-          <w:sz w:val="20"/>
-          <w:szCs w:val="20"/>
-        </w:rPr>
-        <w:t xml:space="preserve">name designation in the Target field to select.  </w:t>
-      </w:r>
-      <w:r>
-        <w:rPr>
-          <w:rFonts w:ascii="Arial" w:hAnsi="Arial" w:cs="Arial"/>
-          <w:bCs/>
-          <w:sz w:val="20"/>
-          <w:szCs w:val="20"/>
-        </w:rPr>
-        <w:t>For instance, if you wanted to image the James Webb, simply enter “JWST” in the target field</w:t>
-      </w:r>
-      <w:r>
-        <w:rPr>
-          <w:rFonts w:ascii="Arial" w:hAnsi="Arial" w:cs="Arial"/>
-          <w:bCs/>
-          <w:sz w:val="20"/>
-          <w:szCs w:val="20"/>
-        </w:rPr>
-        <w:t xml:space="preserve"> and</w:t>
-      </w:r>
-      <w:r>
-        <w:rPr>
-          <w:rFonts w:ascii="Arial" w:hAnsi="Arial" w:cs="Arial"/>
-          <w:bCs/>
-          <w:sz w:val="20"/>
-          <w:szCs w:val="20"/>
-        </w:rPr>
-        <w:t xml:space="preserve"> hit “Horizons” </w:t>
-      </w:r>
-      <w:r>
-        <w:rPr>
-          <w:rFonts w:ascii="Arial" w:hAnsi="Arial" w:cs="Arial"/>
-          <w:bCs/>
-          <w:sz w:val="20"/>
-          <w:szCs w:val="20"/>
-        </w:rPr>
-        <w:t xml:space="preserve">to load and </w:t>
-      </w:r>
-      <w:r>
-        <w:rPr>
-          <w:rFonts w:ascii="Arial" w:hAnsi="Arial" w:cs="Arial"/>
-          <w:bCs/>
-          <w:sz w:val="20"/>
-          <w:szCs w:val="20"/>
-        </w:rPr>
-        <w:t xml:space="preserve">initiate </w:t>
-      </w:r>
-      <w:proofErr w:type="spellStart"/>
-      <w:r>
-        <w:rPr>
-          <w:rFonts w:ascii="Arial" w:hAnsi="Arial" w:cs="Arial"/>
-          <w:bCs/>
-          <w:sz w:val="20"/>
-          <w:szCs w:val="20"/>
-        </w:rPr>
-        <w:t>TheSky</w:t>
-      </w:r>
-      <w:proofErr w:type="spellEnd"/>
-      <w:r>
-        <w:rPr>
-          <w:rFonts w:ascii="Arial" w:hAnsi="Arial" w:cs="Arial"/>
-          <w:bCs/>
-          <w:sz w:val="20"/>
-          <w:szCs w:val="20"/>
-        </w:rPr>
-        <w:t xml:space="preserve"> tracking.</w:t>
-      </w:r>
-      <w:r>
-        <w:rPr>
-          <w:rFonts w:ascii="Arial" w:hAnsi="Arial" w:cs="Arial"/>
-          <w:bCs/>
-          <w:sz w:val="20"/>
-          <w:szCs w:val="20"/>
-        </w:rPr>
-        <w:t xml:space="preserve">  Naming conventions seem to differ between the two </w:t>
-      </w:r>
-      <w:r>
-        <w:rPr>
-          <w:rFonts w:ascii="Arial" w:hAnsi="Arial" w:cs="Arial"/>
-          <w:bCs/>
-          <w:sz w:val="20"/>
-          <w:szCs w:val="20"/>
-        </w:rPr>
-        <w:t>databases, so if one doesn’t work, try the other.</w:t>
-      </w:r>
-      <w:r>
-        <w:rPr>
-          <w:rFonts w:ascii="Arial" w:hAnsi="Arial" w:cs="Arial"/>
-          <w:bCs/>
-          <w:sz w:val="20"/>
-          <w:szCs w:val="20"/>
-        </w:rPr>
-        <w:t xml:space="preserve">  For instance, the MPC database seems more amenable to</w:t>
-      </w:r>
-      <w:r>
-        <w:rPr>
-          <w:rFonts w:ascii="Arial" w:hAnsi="Arial" w:cs="Arial"/>
-          <w:bCs/>
-          <w:sz w:val="20"/>
-          <w:szCs w:val="20"/>
-        </w:rPr>
-        <w:t xml:space="preserve"> successful searches on</w:t>
-      </w:r>
-      <w:r>
-        <w:rPr>
-          <w:rFonts w:ascii="Arial" w:hAnsi="Arial" w:cs="Arial"/>
-          <w:bCs/>
-          <w:sz w:val="20"/>
-          <w:szCs w:val="20"/>
-        </w:rPr>
-        <w:t xml:space="preserve"> </w:t>
-      </w:r>
-      <w:r>
-        <w:rPr>
-          <w:rFonts w:ascii="Arial" w:hAnsi="Arial" w:cs="Arial"/>
-          <w:bCs/>
-          <w:sz w:val="20"/>
-          <w:szCs w:val="20"/>
-        </w:rPr>
-        <w:t xml:space="preserve">target designations such as found in </w:t>
-      </w:r>
-      <w:proofErr w:type="spellStart"/>
-      <w:r>
-        <w:rPr>
-          <w:rFonts w:ascii="Arial" w:hAnsi="Arial" w:cs="Arial"/>
-          <w:bCs/>
-          <w:sz w:val="20"/>
-          <w:szCs w:val="20"/>
-        </w:rPr>
-        <w:t>TheSky</w:t>
-      </w:r>
-      <w:proofErr w:type="spellEnd"/>
-      <w:r>
-        <w:rPr>
-          <w:rFonts w:ascii="Arial" w:hAnsi="Arial" w:cs="Arial"/>
-          <w:bCs/>
-          <w:sz w:val="20"/>
-          <w:szCs w:val="20"/>
-        </w:rPr>
-        <w:t>.</w:t>
+      <w:r>
+        <w:rPr>
+          <w:rFonts w:ascii="Arial" w:hAnsi="Arial" w:cs="Arial"/>
+          <w:bCs/>
+          <w:sz w:val="20"/>
+          <w:szCs w:val="20"/>
+        </w:rPr>
+        <w:t>target designations such as found in TheSky.</w:t>
       </w:r>
     </w:p>
     <w:p>
@@ -965,27 +870,7 @@
           <w:sz w:val="20"/>
           <w:szCs w:val="20"/>
         </w:rPr>
-        <w:t xml:space="preserve">on the </w:t>
-      </w:r>
-      <w:proofErr w:type="spellStart"/>
-      <w:r>
-        <w:rPr>
-          <w:rFonts w:ascii="Arial" w:hAnsi="Arial" w:cs="Arial"/>
-          <w:bCs/>
-          <w:sz w:val="20"/>
-          <w:szCs w:val="20"/>
-        </w:rPr>
-        <w:t>StarChart</w:t>
-      </w:r>
-      <w:proofErr w:type="spellEnd"/>
-      <w:r>
-        <w:rPr>
-          <w:rFonts w:ascii="Arial" w:hAnsi="Arial" w:cs="Arial"/>
-          <w:bCs/>
-          <w:sz w:val="20"/>
-          <w:szCs w:val="20"/>
-        </w:rPr>
-        <w:t xml:space="preserve"> </w:t>
+        <w:t xml:space="preserve">on the StarChart </w:t>
       </w:r>
       <w:r>
         <w:rPr>
@@ -1067,27 +952,7 @@
           <w:sz w:val="20"/>
           <w:szCs w:val="20"/>
         </w:rPr>
-        <w:t xml:space="preserve">un </w:t>
-      </w:r>
-      <w:proofErr w:type="spellStart"/>
-      <w:r>
-        <w:rPr>
-          <w:rFonts w:ascii="Arial" w:hAnsi="Arial" w:cs="Arial"/>
-          <w:bCs/>
-          <w:sz w:val="20"/>
-          <w:szCs w:val="20"/>
-        </w:rPr>
-        <w:t>TheSky</w:t>
-      </w:r>
-      <w:proofErr w:type="spellEnd"/>
-      <w:r>
-        <w:rPr>
-          <w:rFonts w:ascii="Arial" w:hAnsi="Arial" w:cs="Arial"/>
-          <w:bCs/>
-          <w:sz w:val="20"/>
-          <w:szCs w:val="20"/>
-        </w:rPr>
-        <w:t xml:space="preserve"> once (and only once) </w:t>
+        <w:t xml:space="preserve">un TheSky once (and only once) </w:t>
       </w:r>
       <w:r>
         <w:rPr>
@@ -1329,27 +1194,7 @@
           <w:sz w:val="20"/>
           <w:szCs w:val="20"/>
         </w:rPr>
-        <w:t xml:space="preserve">From the </w:t>
-      </w:r>
-      <w:proofErr w:type="spellStart"/>
-      <w:r>
-        <w:rPr>
-          <w:rFonts w:ascii="Arial" w:hAnsi="Arial" w:cs="Arial"/>
-          <w:bCs/>
-          <w:sz w:val="20"/>
-          <w:szCs w:val="20"/>
-        </w:rPr>
-        <w:t>TSXToolKit</w:t>
-      </w:r>
-      <w:proofErr w:type="spellEnd"/>
-      <w:r>
-        <w:rPr>
-          <w:rFonts w:ascii="Arial" w:hAnsi="Arial" w:cs="Arial"/>
-          <w:bCs/>
-          <w:sz w:val="20"/>
-          <w:szCs w:val="20"/>
-        </w:rPr>
-        <w:t xml:space="preserve"> in the Start Menu: </w:t>
+        <w:t xml:space="preserve">From the TSXToolKit in the Start Menu: </w:t>
       </w:r>
       <w:r>
         <w:rPr>
@@ -1424,7 +1269,6 @@
           <w:sz w:val="20"/>
           <w:szCs w:val="20"/>
         </w:rPr>
-        <w:lastRenderedPageBreak/>
         <w:t xml:space="preserve">In </w:t>
       </w:r>
       <w:r>
@@ -1596,17 +1440,7 @@
           <w:sz w:val="20"/>
           <w:szCs w:val="20"/>
         </w:rPr>
-        <w:t xml:space="preserve">In the </w:t>
-      </w:r>
-      <w:proofErr w:type="spellStart"/>
-      <w:r>
-        <w:rPr>
-          <w:rFonts w:ascii="Arial" w:hAnsi="Arial" w:cs="Arial"/>
-          <w:bCs/>
-          <w:sz w:val="20"/>
-          <w:szCs w:val="20"/>
-        </w:rPr>
-        <w:t>The</w:t>
+        <w:t>In the The</w:t>
       </w:r>
       <w:r>
         <w:rPr>
@@ -1617,7 +1451,6 @@
         </w:rPr>
         <w:t>Sky</w:t>
       </w:r>
-      <w:proofErr w:type="spellEnd"/>
       <w:r>
         <w:rPr>
           <w:rFonts w:ascii="Arial" w:hAnsi="Arial" w:cs="Arial"/>
@@ -1740,27 +1573,7 @@
           <w:sz w:val="20"/>
           <w:szCs w:val="20"/>
         </w:rPr>
-        <w:t xml:space="preserve">In </w:t>
-      </w:r>
-      <w:proofErr w:type="spellStart"/>
-      <w:r>
-        <w:rPr>
-          <w:rFonts w:ascii="Arial" w:hAnsi="Arial" w:cs="Arial"/>
-          <w:bCs/>
-          <w:sz w:val="20"/>
-          <w:szCs w:val="20"/>
-        </w:rPr>
-        <w:t>TheSky</w:t>
-      </w:r>
-      <w:proofErr w:type="spellEnd"/>
-      <w:r>
-        <w:rPr>
-          <w:rFonts w:ascii="Arial" w:hAnsi="Arial" w:cs="Arial"/>
-          <w:bCs/>
-          <w:sz w:val="20"/>
-          <w:szCs w:val="20"/>
-        </w:rPr>
-        <w:t>, p</w:t>
+        <w:t>In TheSky, p</w:t>
       </w:r>
       <w:r>
         <w:rPr>
@@ -2143,25 +1956,7 @@
           <w:sz w:val="20"/>
           <w:szCs w:val="20"/>
         </w:rPr>
-        <w:t xml:space="preserve">tracking of a NEO object with </w:t>
-      </w:r>
-      <w:proofErr w:type="spellStart"/>
-      <w:r>
-        <w:rPr>
-          <w:rFonts w:ascii="Arial" w:hAnsi="Arial" w:cs="Arial"/>
-          <w:sz w:val="20"/>
-          <w:szCs w:val="20"/>
-        </w:rPr>
-        <w:t>TheSky</w:t>
-      </w:r>
-      <w:proofErr w:type="spellEnd"/>
-      <w:r>
-        <w:rPr>
-          <w:rFonts w:ascii="Arial" w:hAnsi="Arial" w:cs="Arial"/>
-          <w:sz w:val="20"/>
-          <w:szCs w:val="20"/>
-        </w:rPr>
-        <w:t>.</w:t>
+        <w:t>tracking of a NEO object with TheSky.</w:t>
       </w:r>
     </w:p>
     <w:p>
@@ -2194,27 +1989,8 @@
           <w:sz w:val="20"/>
           <w:szCs w:val="20"/>
         </w:rPr>
-        <w:t xml:space="preserve"> input to </w:t>
-      </w:r>
-      <w:proofErr w:type="spellStart"/>
-      <w:r>
-        <w:rPr>
-          <w:rFonts w:ascii="Arial" w:hAnsi="Arial" w:cs="Arial"/>
-          <w:sz w:val="20"/>
-          <w:szCs w:val="20"/>
-        </w:rPr>
-        <w:t>TheSky</w:t>
-      </w:r>
-      <w:proofErr w:type="spellEnd"/>
-      <w:r>
-        <w:rPr>
-          <w:rFonts w:ascii="Arial" w:hAnsi="Arial" w:cs="Arial"/>
-          <w:sz w:val="20"/>
-          <w:szCs w:val="20"/>
-        </w:rPr>
-        <w:t xml:space="preserve"> using the </w:t>
-      </w:r>
-      <w:proofErr w:type="spellStart"/>
+        <w:t xml:space="preserve"> input to TheSky using the </w:t>
+      </w:r>
       <w:r>
         <w:rPr>
           <w:rFonts w:ascii="Arial" w:hAnsi="Arial" w:cs="Arial"/>
@@ -2223,18 +1999,7 @@
           <w:sz w:val="20"/>
           <w:szCs w:val="20"/>
         </w:rPr>
-        <w:t>TSXToolKit</w:t>
-      </w:r>
-      <w:proofErr w:type="spellEnd"/>
-      <w:r>
-        <w:rPr>
-          <w:rFonts w:ascii="Arial" w:hAnsi="Arial" w:cs="Arial"/>
-          <w:i/>
-          <w:iCs/>
-          <w:sz w:val="20"/>
-          <w:szCs w:val="20"/>
-        </w:rPr>
-        <w:t xml:space="preserve"> Transient Search</w:t>
+        <w:t>TSXToolKit Transient Search</w:t>
       </w:r>
       <w:r>
         <w:rPr>
@@ -2290,25 +2055,7 @@
           <w:sz w:val="20"/>
           <w:szCs w:val="20"/>
         </w:rPr>
-        <w:t xml:space="preserve"> in </w:t>
-      </w:r>
-      <w:proofErr w:type="spellStart"/>
-      <w:r>
-        <w:rPr>
-          <w:rFonts w:ascii="Arial" w:hAnsi="Arial" w:cs="Arial"/>
-          <w:sz w:val="20"/>
-          <w:szCs w:val="20"/>
-        </w:rPr>
-        <w:t>TheSky</w:t>
-      </w:r>
-      <w:proofErr w:type="spellEnd"/>
-      <w:r>
-        <w:rPr>
-          <w:rFonts w:ascii="Arial" w:hAnsi="Arial" w:cs="Arial"/>
-          <w:sz w:val="20"/>
-          <w:szCs w:val="20"/>
-        </w:rPr>
-        <w:t xml:space="preserve"> (or input </w:t>
+        <w:t xml:space="preserve"> in TheSky (or input </w:t>
       </w:r>
       <w:r>
         <w:rPr>
@@ -2465,27 +2212,7 @@
           <w:sz w:val="20"/>
           <w:szCs w:val="20"/>
         </w:rPr>
-        <w:t xml:space="preserve">  In the case of a satellite target, the </w:t>
-      </w:r>
-      <w:proofErr w:type="spellStart"/>
-      <w:r>
-        <w:rPr>
-          <w:rFonts w:ascii="Arial" w:hAnsi="Arial" w:cs="Arial"/>
-          <w:bCs/>
-          <w:sz w:val="20"/>
-          <w:szCs w:val="20"/>
-        </w:rPr>
-        <w:t>CelesTrak</w:t>
-      </w:r>
-      <w:proofErr w:type="spellEnd"/>
-      <w:r>
-        <w:rPr>
-          <w:rFonts w:ascii="Arial" w:hAnsi="Arial" w:cs="Arial"/>
-          <w:bCs/>
-          <w:sz w:val="20"/>
-          <w:szCs w:val="20"/>
-        </w:rPr>
-        <w:t xml:space="preserve"> </w:t>
+        <w:t xml:space="preserve">  In the case of a satellite target, the CelesTrak </w:t>
       </w:r>
       <w:r>
         <w:rPr>
@@ -2984,7 +2711,6 @@
           <w:szCs w:val="20"/>
           <w:u w:val="single"/>
         </w:rPr>
-        <w:lastRenderedPageBreak/>
         <w:t>Range</w:t>
       </w:r>
       <w:r>
@@ -3202,27 +2928,7 @@
           <w:sz w:val="20"/>
           <w:szCs w:val="20"/>
         </w:rPr>
-        <w:t xml:space="preserve">Number of days to plot the position of this target on the TSX </w:t>
-      </w:r>
-      <w:proofErr w:type="spellStart"/>
-      <w:r>
-        <w:rPr>
-          <w:rFonts w:ascii="Arial" w:hAnsi="Arial" w:cs="Arial"/>
-          <w:bCs/>
-          <w:sz w:val="20"/>
-          <w:szCs w:val="20"/>
-        </w:rPr>
-        <w:t>StarChart</w:t>
-      </w:r>
-      <w:proofErr w:type="spellEnd"/>
-      <w:r>
-        <w:rPr>
-          <w:rFonts w:ascii="Arial" w:hAnsi="Arial" w:cs="Arial"/>
-          <w:bCs/>
-          <w:sz w:val="20"/>
-          <w:szCs w:val="20"/>
-        </w:rPr>
-        <w:t xml:space="preserve"> (see below).</w:t>
+        <w:t>Number of days to plot the position of this target on the TSX StarChart (see below).</w:t>
       </w:r>
     </w:p>
     <w:p>
@@ -3344,27 +3050,7 @@
           <w:sz w:val="20"/>
           <w:szCs w:val="20"/>
         </w:rPr>
-        <w:t xml:space="preserve">updates </w:t>
-      </w:r>
-      <w:proofErr w:type="spellStart"/>
-      <w:r>
-        <w:rPr>
-          <w:rFonts w:ascii="Arial" w:hAnsi="Arial" w:cs="Arial"/>
-          <w:bCs/>
-          <w:sz w:val="20"/>
-          <w:szCs w:val="20"/>
-        </w:rPr>
-        <w:t>TheSky</w:t>
-      </w:r>
-      <w:proofErr w:type="spellEnd"/>
-      <w:r>
-        <w:rPr>
-          <w:rFonts w:ascii="Arial" w:hAnsi="Arial" w:cs="Arial"/>
-          <w:bCs/>
-          <w:sz w:val="20"/>
-          <w:szCs w:val="20"/>
-        </w:rPr>
-        <w:t xml:space="preserve"> </w:t>
+        <w:t xml:space="preserve">updates TheSky </w:t>
       </w:r>
       <w:r>
         <w:rPr>
@@ -3613,27 +3299,7 @@
           <w:sz w:val="20"/>
           <w:szCs w:val="20"/>
         </w:rPr>
-        <w:t xml:space="preserve">tracking change to </w:t>
-      </w:r>
-      <w:proofErr w:type="spellStart"/>
-      <w:r>
-        <w:rPr>
-          <w:rFonts w:ascii="Arial" w:hAnsi="Arial" w:cs="Arial"/>
-          <w:bCs/>
-          <w:sz w:val="20"/>
-          <w:szCs w:val="20"/>
-        </w:rPr>
-        <w:t>TheSky</w:t>
-      </w:r>
-      <w:proofErr w:type="spellEnd"/>
-      <w:r>
-        <w:rPr>
-          <w:rFonts w:ascii="Arial" w:hAnsi="Arial" w:cs="Arial"/>
-          <w:bCs/>
-          <w:sz w:val="20"/>
-          <w:szCs w:val="20"/>
-        </w:rPr>
-        <w:t>.</w:t>
+        <w:t>tracking change to TheSky.</w:t>
       </w:r>
     </w:p>
     <w:p>
@@ -3960,27 +3626,7 @@
           <w:sz w:val="20"/>
           <w:szCs w:val="20"/>
         </w:rPr>
-        <w:t xml:space="preserve">using automation of </w:t>
-      </w:r>
-      <w:proofErr w:type="spellStart"/>
-      <w:r>
-        <w:rPr>
-          <w:rFonts w:ascii="Arial" w:hAnsi="Arial" w:cs="Arial"/>
-          <w:bCs/>
-          <w:sz w:val="20"/>
-          <w:szCs w:val="20"/>
-        </w:rPr>
-        <w:t>TheSky</w:t>
-      </w:r>
-      <w:proofErr w:type="spellEnd"/>
-      <w:r>
-        <w:rPr>
-          <w:rFonts w:ascii="Arial" w:hAnsi="Arial" w:cs="Arial"/>
-          <w:bCs/>
-          <w:sz w:val="20"/>
-          <w:szCs w:val="20"/>
-        </w:rPr>
-        <w:t>.</w:t>
+        <w:t>using automation of TheSky.</w:t>
       </w:r>
     </w:p>
     <w:p>
@@ -4302,27 +3948,7 @@
           <w:sz w:val="20"/>
           <w:szCs w:val="20"/>
         </w:rPr>
-        <w:t xml:space="preserve"> </w:t>
-      </w:r>
-      <w:proofErr w:type="spellStart"/>
-      <w:r>
-        <w:rPr>
-          <w:rFonts w:ascii="Arial" w:hAnsi="Arial" w:cs="Arial"/>
-          <w:bCs/>
-          <w:sz w:val="20"/>
-          <w:szCs w:val="20"/>
-        </w:rPr>
-        <w:t>TheSky</w:t>
-      </w:r>
-      <w:proofErr w:type="spellEnd"/>
-      <w:r>
-        <w:rPr>
-          <w:rFonts w:ascii="Arial" w:hAnsi="Arial" w:cs="Arial"/>
-          <w:bCs/>
-          <w:sz w:val="20"/>
-          <w:szCs w:val="20"/>
-        </w:rPr>
-        <w:t>.</w:t>
+        <w:t xml:space="preserve"> TheSky.</w:t>
       </w:r>
     </w:p>
     <w:p>
@@ -4418,7 +4044,6 @@
           <w:szCs w:val="24"/>
           <w:u w:val="single"/>
         </w:rPr>
-        <w:lastRenderedPageBreak/>
         <w:t xml:space="preserve">Structure </w:t>
       </w:r>
     </w:p>
@@ -4534,7 +4159,6 @@
           <w:szCs w:val="24"/>
           <w:u w:val="single"/>
         </w:rPr>
-        <w:lastRenderedPageBreak/>
         <w:drawing>
           <wp:inline distT="0" distB="0" distL="0" distR="0" wp14:anchorId="2B13E41B" wp14:editId="6E081F32">
             <wp:extent cx="6858000" cy="4236085"/>
@@ -4748,47 +4372,7 @@
           <w:sz w:val="20"/>
           <w:szCs w:val="20"/>
         </w:rPr>
-        <w:t>This translation is applied to both the position of the target (RA/Dec) and tracking rate (</w:t>
-      </w:r>
-      <w:proofErr w:type="spellStart"/>
-      <w:r>
-        <w:rPr>
-          <w:rFonts w:ascii="Arial" w:hAnsi="Arial" w:cs="Arial"/>
-          <w:bCs/>
-          <w:sz w:val="20"/>
-          <w:szCs w:val="20"/>
-        </w:rPr>
-        <w:t>dRA</w:t>
-      </w:r>
-      <w:proofErr w:type="spellEnd"/>
-      <w:r>
-        <w:rPr>
-          <w:rFonts w:ascii="Arial" w:hAnsi="Arial" w:cs="Arial"/>
-          <w:bCs/>
-          <w:sz w:val="20"/>
-          <w:szCs w:val="20"/>
-        </w:rPr>
-        <w:t>/</w:t>
-      </w:r>
-      <w:proofErr w:type="spellStart"/>
-      <w:r>
-        <w:rPr>
-          <w:rFonts w:ascii="Arial" w:hAnsi="Arial" w:cs="Arial"/>
-          <w:bCs/>
-          <w:sz w:val="20"/>
-          <w:szCs w:val="20"/>
-        </w:rPr>
-        <w:t>dDec</w:t>
-      </w:r>
-      <w:proofErr w:type="spellEnd"/>
-      <w:r>
-        <w:rPr>
-          <w:rFonts w:ascii="Arial" w:hAnsi="Arial" w:cs="Arial"/>
-          <w:bCs/>
-          <w:sz w:val="20"/>
-          <w:szCs w:val="20"/>
-        </w:rPr>
-        <w:t>) as viewed from the user’s site.</w:t>
+        <w:t>This translation is applied to both the position of the target (RA/Dec) and tracking rate (dRA/dDec) as viewed from the user’s site.</w:t>
       </w:r>
     </w:p>
     <w:p>
@@ -4826,47 +4410,7 @@
           <w:sz w:val="20"/>
           <w:szCs w:val="20"/>
         </w:rPr>
-        <w:t>the specific location (</w:t>
-      </w:r>
-      <w:proofErr w:type="spellStart"/>
-      <w:r>
-        <w:rPr>
-          <w:rFonts w:ascii="Arial" w:hAnsi="Arial" w:cs="Arial"/>
-          <w:bCs/>
-          <w:sz w:val="20"/>
-          <w:szCs w:val="20"/>
-        </w:rPr>
-        <w:t>lat</w:t>
-      </w:r>
-      <w:proofErr w:type="spellEnd"/>
-      <w:r>
-        <w:rPr>
-          <w:rFonts w:ascii="Arial" w:hAnsi="Arial" w:cs="Arial"/>
-          <w:bCs/>
-          <w:sz w:val="20"/>
-          <w:szCs w:val="20"/>
-        </w:rPr>
-        <w:t xml:space="preserve">, long, </w:t>
-      </w:r>
-      <w:proofErr w:type="spellStart"/>
-      <w:r>
-        <w:rPr>
-          <w:rFonts w:ascii="Arial" w:hAnsi="Arial" w:cs="Arial"/>
-          <w:bCs/>
-          <w:sz w:val="20"/>
-          <w:szCs w:val="20"/>
-        </w:rPr>
-        <w:t>elev</w:t>
-      </w:r>
-      <w:proofErr w:type="spellEnd"/>
-      <w:r>
-        <w:rPr>
-          <w:rFonts w:ascii="Arial" w:hAnsi="Arial" w:cs="Arial"/>
-          <w:bCs/>
-          <w:sz w:val="20"/>
-          <w:szCs w:val="20"/>
-        </w:rPr>
-        <w:t>) of the observer.</w:t>
+        <w:t>the specific location (lat, long, elev) of the observer.</w:t>
       </w:r>
     </w:p>
     <w:p>
@@ -4913,25 +4457,7 @@
           <w:sz w:val="20"/>
           <w:szCs w:val="20"/>
         </w:rPr>
-        <w:t xml:space="preserve"> is a Windows Forms executable, written in Visual C#.  The app requires </w:t>
-      </w:r>
-      <w:proofErr w:type="spellStart"/>
-      <w:r>
-        <w:rPr>
-          <w:rFonts w:ascii="Arial" w:hAnsi="Arial" w:cs="Arial"/>
-          <w:sz w:val="20"/>
-          <w:szCs w:val="20"/>
-        </w:rPr>
-        <w:t>TheSkyX</w:t>
-      </w:r>
-      <w:proofErr w:type="spellEnd"/>
-      <w:r>
-        <w:rPr>
-          <w:rFonts w:ascii="Arial" w:hAnsi="Arial" w:cs="Arial"/>
-          <w:sz w:val="20"/>
-          <w:szCs w:val="20"/>
-        </w:rPr>
-        <w:t xml:space="preserve"> </w:t>
+        <w:t xml:space="preserve"> is a Windows Forms executable, written in Visual C#.  The app requires TheSkyX </w:t>
       </w:r>
       <w:r>
         <w:rPr>
@@ -5040,25 +4566,7 @@
           <w:sz w:val="20"/>
           <w:szCs w:val="20"/>
         </w:rPr>
-        <w:t xml:space="preserve"> on GitHub in the “publish” directory of </w:t>
-      </w:r>
-      <w:proofErr w:type="spellStart"/>
-      <w:r>
-        <w:rPr>
-          <w:rFonts w:ascii="Arial" w:hAnsi="Arial" w:cs="Arial"/>
-          <w:sz w:val="20"/>
-          <w:szCs w:val="20"/>
-        </w:rPr>
-        <w:t>rrskybox</w:t>
-      </w:r>
-      <w:proofErr w:type="spellEnd"/>
-      <w:r>
-        <w:rPr>
-          <w:rFonts w:ascii="Arial" w:hAnsi="Arial" w:cs="Arial"/>
-          <w:sz w:val="20"/>
-          <w:szCs w:val="20"/>
-        </w:rPr>
-        <w:t>/</w:t>
+        <w:t xml:space="preserve"> on GitHub in the “publish” directory of rrskybox/</w:t>
       </w:r>
       <w:r>
         <w:rPr>
@@ -5203,25 +4711,7 @@
           <w:sz w:val="20"/>
           <w:szCs w:val="20"/>
         </w:rPr>
-        <w:t xml:space="preserve"> Upon completion, an application icon will have been added to the start menu under "</w:t>
-      </w:r>
-      <w:proofErr w:type="spellStart"/>
-      <w:r>
-        <w:rPr>
-          <w:rFonts w:ascii="Arial" w:hAnsi="Arial" w:cs="Arial"/>
-          <w:sz w:val="20"/>
-          <w:szCs w:val="20"/>
-        </w:rPr>
-        <w:t>TSXToolKit</w:t>
-      </w:r>
-      <w:proofErr w:type="spellEnd"/>
-      <w:r>
-        <w:rPr>
-          <w:rFonts w:ascii="Arial" w:hAnsi="Arial" w:cs="Arial"/>
-          <w:sz w:val="20"/>
-          <w:szCs w:val="20"/>
-        </w:rPr>
-        <w:t>" with the name "</w:t>
+        <w:t xml:space="preserve"> Upon completion, an application icon will have been added to the start menu under "TSXToolKit" with the name "</w:t>
       </w:r>
       <w:r>
         <w:rPr>
@@ -5262,69 +4752,15 @@
           <w:sz w:val="20"/>
           <w:szCs w:val="20"/>
         </w:rPr>
-        <w:t xml:space="preserve">fter the installation of any new </w:t>
-      </w:r>
-      <w:proofErr w:type="spellStart"/>
-      <w:r>
-        <w:rPr>
-          <w:rFonts w:ascii="Arial" w:hAnsi="Arial" w:cs="Arial"/>
-          <w:sz w:val="20"/>
-          <w:szCs w:val="20"/>
-        </w:rPr>
-        <w:t>TheSky</w:t>
-      </w:r>
-      <w:proofErr w:type="spellEnd"/>
-      <w:r>
-        <w:rPr>
-          <w:rFonts w:ascii="Arial" w:hAnsi="Arial" w:cs="Arial"/>
-          <w:sz w:val="20"/>
-          <w:szCs w:val="20"/>
-        </w:rPr>
-        <w:t xml:space="preserve"> build, the user must launch </w:t>
-      </w:r>
-      <w:proofErr w:type="spellStart"/>
-      <w:r>
-        <w:rPr>
-          <w:rFonts w:ascii="Arial" w:hAnsi="Arial" w:cs="Arial"/>
-          <w:sz w:val="20"/>
-          <w:szCs w:val="20"/>
-        </w:rPr>
-        <w:t>TheSky</w:t>
-      </w:r>
-      <w:proofErr w:type="spellEnd"/>
-      <w:r>
-        <w:rPr>
-          <w:rFonts w:ascii="Arial" w:hAnsi="Arial" w:cs="Arial"/>
-          <w:sz w:val="20"/>
-          <w:szCs w:val="20"/>
-        </w:rPr>
-        <w:t xml:space="preserve"> once</w:t>
-      </w:r>
-      <w:r>
-        <w:rPr>
-          <w:rFonts w:ascii="Arial" w:hAnsi="Arial" w:cs="Arial"/>
-          <w:sz w:val="20"/>
-          <w:szCs w:val="20"/>
-        </w:rPr>
-        <w:t xml:space="preserve"> in Administrator Mode in order to allow </w:t>
-      </w:r>
-      <w:proofErr w:type="spellStart"/>
-      <w:r>
-        <w:rPr>
-          <w:rFonts w:ascii="Arial" w:hAnsi="Arial" w:cs="Arial"/>
-          <w:sz w:val="20"/>
-          <w:szCs w:val="20"/>
-        </w:rPr>
-        <w:t>TheSky</w:t>
-      </w:r>
-      <w:proofErr w:type="spellEnd"/>
-      <w:r>
-        <w:rPr>
-          <w:rFonts w:ascii="Arial" w:hAnsi="Arial" w:cs="Arial"/>
-          <w:sz w:val="20"/>
-          <w:szCs w:val="20"/>
-        </w:rPr>
-        <w:t xml:space="preserve"> to register its interface libraries.</w:t>
+        <w:t>fter the installation of any new TheSky build, the user must launch TheSky once</w:t>
+      </w:r>
+      <w:r>
+        <w:rPr>
+          <w:rFonts w:ascii="Arial" w:hAnsi="Arial" w:cs="Arial"/>
+          <w:sz w:val="20"/>
+          <w:szCs w:val="20"/>
+        </w:rPr>
+        <w:t xml:space="preserve"> in Administrator Mode in order to allow TheSky to register its interface libraries.</w:t>
       </w:r>
     </w:p>
     <w:p>
@@ -5344,7 +4780,6 @@
           <w:szCs w:val="24"/>
           <w:u w:val="single"/>
         </w:rPr>
-        <w:lastRenderedPageBreak/>
         <w:t>Support</w:t>
       </w:r>
     </w:p>
@@ -5562,13 +4997,15 @@
           <w:rFonts w:ascii="Arial" w:hAnsi="Arial" w:cs="Arial"/>
           <w:sz w:val="20"/>
           <w:szCs w:val="20"/>
-        </w:rPr>
-      </w:pPr>
-      <w:r>
-        <w:rPr>
-          <w:rFonts w:ascii="Arial" w:hAnsi="Arial" w:cs="Arial"/>
-          <w:sz w:val="20"/>
-          <w:szCs w:val="20"/>
+          <w:lang w:val="fr-FR"/>
+        </w:rPr>
+      </w:pPr>
+      <w:r>
+        <w:rPr>
+          <w:rFonts w:ascii="Arial" w:hAnsi="Arial" w:cs="Arial"/>
+          <w:sz w:val="20"/>
+          <w:szCs w:val="20"/>
+          <w:lang w:val="fr-FR"/>
         </w:rPr>
         <w:t>B&lt;b&gt;_T&lt;t&gt;_E&lt;e&gt;_F&lt;f&gt;</w:t>
       </w:r>
@@ -5584,6 +5021,7 @@
           <w:rFonts w:ascii="Arial" w:hAnsi="Arial" w:cs="Arial"/>
           <w:sz w:val="20"/>
           <w:szCs w:val="20"/>
+          <w:lang w:val="fr-FR"/>
         </w:rPr>
       </w:pPr>
     </w:p>
@@ -5598,6 +5036,7 @@
           <w:rFonts w:ascii="Arial" w:hAnsi="Arial" w:cs="Arial"/>
           <w:sz w:val="20"/>
           <w:szCs w:val="20"/>
+          <w:lang w:val="fr-FR"/>
         </w:rPr>
       </w:pPr>
       <w:r>
@@ -5606,6 +5045,7 @@
           <w:color w:val="008000"/>
           <w:sz w:val="20"/>
           <w:szCs w:val="20"/>
+          <w:lang w:val="fr-FR"/>
         </w:rPr>
         <w:t xml:space="preserve"> </w:t>
       </w:r>
@@ -5614,6 +5054,7 @@
           <w:rFonts w:ascii="Arial" w:hAnsi="Arial" w:cs="Arial"/>
           <w:sz w:val="20"/>
           <w:szCs w:val="20"/>
+          <w:lang w:val="fr-FR"/>
         </w:rPr>
         <w:t xml:space="preserve">where </w:t>
       </w:r>
@@ -5629,6 +5070,7 @@
           <w:rFonts w:ascii="Arial" w:hAnsi="Arial" w:cs="Arial"/>
           <w:sz w:val="20"/>
           <w:szCs w:val="20"/>
+          <w:lang w:val="fr-FR"/>
         </w:rPr>
       </w:pPr>
     </w:p>
@@ -5643,6 +5085,7 @@
           <w:rFonts w:ascii="Arial" w:hAnsi="Arial" w:cs="Arial"/>
           <w:sz w:val="20"/>
           <w:szCs w:val="20"/>
+          <w:lang w:val="fr-FR"/>
         </w:rPr>
       </w:pPr>
       <w:r>
@@ -5652,6 +5095,7 @@
           <w:iCs/>
           <w:sz w:val="20"/>
           <w:szCs w:val="20"/>
+          <w:lang w:val="fr-FR"/>
         </w:rPr>
         <w:t>&lt;b&gt;</w:t>
       </w:r>
@@ -5660,19 +5104,10 @@
           <w:rFonts w:ascii="Arial" w:hAnsi="Arial" w:cs="Arial"/>
           <w:sz w:val="20"/>
           <w:szCs w:val="20"/>
-        </w:rPr>
-        <w:t xml:space="preserve"> = binning:  “1x1”, “2x2”, </w:t>
-      </w:r>
-      <w:proofErr w:type="spellStart"/>
-      <w:r>
-        <w:rPr>
-          <w:rFonts w:ascii="Arial" w:hAnsi="Arial" w:cs="Arial"/>
-          <w:sz w:val="20"/>
-          <w:szCs w:val="20"/>
-        </w:rPr>
-        <w:t>etc</w:t>
-      </w:r>
-      <w:proofErr w:type="spellEnd"/>
+          <w:lang w:val="fr-FR"/>
+        </w:rPr>
+        <w:t xml:space="preserve"> = binning:  “1x1”, “2x2”, etc</w:t>
+      </w:r>
     </w:p>
     <w:p>
       <w:pPr>
@@ -5685,6 +5120,7 @@
           <w:rFonts w:ascii="Arial" w:hAnsi="Arial" w:cs="Arial"/>
           <w:sz w:val="20"/>
           <w:szCs w:val="20"/>
+          <w:lang w:val="fr-FR"/>
         </w:rPr>
       </w:pPr>
       <w:r>
@@ -5694,6 +5130,7 @@
           <w:iCs/>
           <w:sz w:val="20"/>
           <w:szCs w:val="20"/>
+          <w:lang w:val="fr-FR"/>
         </w:rPr>
         <w:t>&lt;t&gt;</w:t>
       </w:r>
@@ -5702,26 +5139,9 @@
           <w:rFonts w:ascii="Arial" w:hAnsi="Arial" w:cs="Arial"/>
           <w:sz w:val="20"/>
           <w:szCs w:val="20"/>
-        </w:rPr>
-        <w:t xml:space="preserve"> = temperature in Centigrade:  “-</w:t>
-      </w:r>
-      <w:proofErr w:type="spellStart"/>
-      <w:r>
-        <w:rPr>
-          <w:rFonts w:ascii="Arial" w:hAnsi="Arial" w:cs="Arial"/>
-          <w:sz w:val="20"/>
-          <w:szCs w:val="20"/>
-        </w:rPr>
-        <w:t>x.x</w:t>
-      </w:r>
-      <w:proofErr w:type="spellEnd"/>
-      <w:r>
-        <w:rPr>
-          <w:rFonts w:ascii="Arial" w:hAnsi="Arial" w:cs="Arial"/>
-          <w:sz w:val="20"/>
-          <w:szCs w:val="20"/>
-        </w:rPr>
-        <w:t>”</w:t>
+          <w:lang w:val="fr-FR"/>
+        </w:rPr>
+        <w:t xml:space="preserve"> = temperature in Centigrade:  “-x.x”</w:t>
       </w:r>
     </w:p>
     <w:p>
@@ -5735,6 +5155,7 @@
           <w:rFonts w:ascii="Arial" w:hAnsi="Arial" w:cs="Arial"/>
           <w:sz w:val="20"/>
           <w:szCs w:val="20"/>
+          <w:lang w:val="fr-FR"/>
         </w:rPr>
       </w:pPr>
       <w:r>
@@ -5744,6 +5165,7 @@
           <w:iCs/>
           <w:sz w:val="20"/>
           <w:szCs w:val="20"/>
+          <w:lang w:val="fr-FR"/>
         </w:rPr>
         <w:t>&lt;e&gt;</w:t>
       </w:r>
@@ -5752,6 +5174,7 @@
           <w:rFonts w:ascii="Arial" w:hAnsi="Arial" w:cs="Arial"/>
           <w:sz w:val="20"/>
           <w:szCs w:val="20"/>
+          <w:lang w:val="fr-FR"/>
         </w:rPr>
         <w:t xml:space="preserve"> = exposure in seconds: “e.ee”</w:t>
       </w:r>
@@ -5767,6 +5190,7 @@
           <w:rFonts w:ascii="Arial" w:hAnsi="Arial" w:cs="Arial"/>
           <w:sz w:val="20"/>
           <w:szCs w:val="20"/>
+          <w:lang w:val="fr-FR"/>
         </w:rPr>
       </w:pPr>
       <w:r>
@@ -5776,6 +5200,7 @@
           <w:iCs/>
           <w:sz w:val="20"/>
           <w:szCs w:val="20"/>
+          <w:lang w:val="fr-FR"/>
         </w:rPr>
         <w:t>&lt;f&gt;</w:t>
       </w:r>
@@ -5784,19 +5209,10 @@
           <w:rFonts w:ascii="Arial" w:hAnsi="Arial" w:cs="Arial"/>
           <w:sz w:val="20"/>
           <w:szCs w:val="20"/>
-        </w:rPr>
-        <w:t xml:space="preserve"> = filter name: “C”, “R”, “B”, “V”, </w:t>
-      </w:r>
-      <w:proofErr w:type="spellStart"/>
-      <w:r>
-        <w:rPr>
-          <w:rFonts w:ascii="Arial" w:hAnsi="Arial" w:cs="Arial"/>
-          <w:sz w:val="20"/>
-          <w:szCs w:val="20"/>
-        </w:rPr>
-        <w:t>etc</w:t>
-      </w:r>
-      <w:proofErr w:type="spellEnd"/>
+          <w:lang w:val="fr-FR"/>
+        </w:rPr>
+        <w:t xml:space="preserve"> = filter name: “C”, “R”, “B”, “V”, etc</w:t>
+      </w:r>
     </w:p>
     <w:p>
       <w:pPr>
@@ -5809,6 +5225,7 @@
           <w:rFonts w:ascii="Arial" w:hAnsi="Arial" w:cs="Arial"/>
           <w:sz w:val="20"/>
           <w:szCs w:val="20"/>
+          <w:lang w:val="fr-FR"/>
         </w:rPr>
       </w:pPr>
     </w:p>
@@ -5823,13 +5240,15 @@
           <w:rFonts w:ascii="Arial" w:hAnsi="Arial" w:cs="Arial"/>
           <w:sz w:val="20"/>
           <w:szCs w:val="20"/>
-        </w:rPr>
-      </w:pPr>
-      <w:r>
-        <w:rPr>
-          <w:rFonts w:ascii="Arial" w:hAnsi="Arial" w:cs="Arial"/>
-          <w:sz w:val="20"/>
-          <w:szCs w:val="20"/>
+          <w:lang w:val="fr-FR"/>
+        </w:rPr>
+      </w:pPr>
+      <w:r>
+        <w:rPr>
+          <w:rFonts w:ascii="Arial" w:hAnsi="Arial" w:cs="Arial"/>
+          <w:sz w:val="20"/>
+          <w:szCs w:val="20"/>
+          <w:lang w:val="fr-FR"/>
         </w:rPr>
         <w:t>Examples</w:t>
       </w:r>
@@ -5845,6 +5264,7 @@
           <w:rFonts w:ascii="Arial" w:hAnsi="Arial" w:cs="Arial"/>
           <w:sz w:val="20"/>
           <w:szCs w:val="20"/>
+          <w:lang w:val="fr-FR"/>
         </w:rPr>
       </w:pPr>
     </w:p>
@@ -5859,13 +5279,15 @@
           <w:rFonts w:ascii="Arial" w:hAnsi="Arial" w:cs="Arial"/>
           <w:sz w:val="20"/>
           <w:szCs w:val="20"/>
-        </w:rPr>
-      </w:pPr>
-      <w:r>
-        <w:rPr>
-          <w:rFonts w:ascii="Arial" w:hAnsi="Arial" w:cs="Arial"/>
-          <w:sz w:val="20"/>
-          <w:szCs w:val="20"/>
+          <w:lang w:val="fr-FR"/>
+        </w:rPr>
+      </w:pPr>
+      <w:r>
+        <w:rPr>
+          <w:rFonts w:ascii="Arial" w:hAnsi="Arial" w:cs="Arial"/>
+          <w:sz w:val="20"/>
+          <w:szCs w:val="20"/>
+          <w:lang w:val="fr-FR"/>
         </w:rPr>
         <w:t>“B1x1_T-20.2_E35.00_FC”</w:t>
       </w:r>
@@ -6042,25 +5464,7 @@
           <w:sz w:val="20"/>
           <w:szCs w:val="20"/>
         </w:rPr>
-        <w:t xml:space="preserve">The easiest way to prepare for a full reduction library, is to use the </w:t>
-      </w:r>
-      <w:proofErr w:type="spellStart"/>
-      <w:r>
-        <w:rPr>
-          <w:rFonts w:ascii="Arial" w:hAnsi="Arial" w:cs="Arial"/>
-          <w:sz w:val="20"/>
-          <w:szCs w:val="20"/>
-        </w:rPr>
-        <w:t>TSXToolKit</w:t>
-      </w:r>
-      <w:proofErr w:type="spellEnd"/>
-      <w:r>
-        <w:rPr>
-          <w:rFonts w:ascii="Arial" w:hAnsi="Arial" w:cs="Arial"/>
-          <w:sz w:val="20"/>
-          <w:szCs w:val="20"/>
-        </w:rPr>
-        <w:t xml:space="preserve"> utility </w:t>
+        <w:t xml:space="preserve">The easiest way to prepare for a full reduction library, is to use the TSXToolKit utility </w:t>
       </w:r>
       <w:r>
         <w:rPr>
@@ -6078,25 +5482,7 @@
           <w:sz w:val="20"/>
           <w:szCs w:val="20"/>
         </w:rPr>
-        <w:t xml:space="preserve"> which can be downloaded from GitHub/</w:t>
-      </w:r>
-      <w:proofErr w:type="spellStart"/>
-      <w:r>
-        <w:rPr>
-          <w:rFonts w:ascii="Arial" w:hAnsi="Arial" w:cs="Arial"/>
-          <w:sz w:val="20"/>
-          <w:szCs w:val="20"/>
-        </w:rPr>
-        <w:t>rrskybox</w:t>
-      </w:r>
-      <w:proofErr w:type="spellEnd"/>
-      <w:r>
-        <w:rPr>
-          <w:rFonts w:ascii="Arial" w:hAnsi="Arial" w:cs="Arial"/>
-          <w:sz w:val="20"/>
-          <w:szCs w:val="20"/>
-        </w:rPr>
-        <w:t xml:space="preserve">/Reduction Library Generator in same manner as </w:t>
+        <w:t xml:space="preserve"> which can be downloaded from GitHub/rrskybox/Reduction Library Generator in same manner as </w:t>
       </w:r>
       <w:r>
         <w:rPr>
@@ -6112,43 +5498,7 @@
           <w:sz w:val="20"/>
           <w:szCs w:val="20"/>
         </w:rPr>
-        <w:t xml:space="preserve"> itself.  This utility will parse a directory and subdirectories for reduction files, compile their paths into the folder structure and naming conventions, then directly modify the </w:t>
-      </w:r>
-      <w:proofErr w:type="spellStart"/>
-      <w:r>
-        <w:rPr>
-          <w:rFonts w:ascii="Arial" w:hAnsi="Arial" w:cs="Arial"/>
-          <w:sz w:val="20"/>
-          <w:szCs w:val="20"/>
-        </w:rPr>
-        <w:t>TheSky</w:t>
-      </w:r>
-      <w:proofErr w:type="spellEnd"/>
-      <w:r>
-        <w:rPr>
-          <w:rFonts w:ascii="Arial" w:hAnsi="Arial" w:cs="Arial"/>
-          <w:sz w:val="20"/>
-          <w:szCs w:val="20"/>
-        </w:rPr>
-        <w:t xml:space="preserve"> configuration file to accept the libraries.  </w:t>
-      </w:r>
-      <w:proofErr w:type="spellStart"/>
-      <w:r>
-        <w:rPr>
-          <w:rFonts w:ascii="Arial" w:hAnsi="Arial" w:cs="Arial"/>
-          <w:sz w:val="20"/>
-          <w:szCs w:val="20"/>
-        </w:rPr>
-        <w:t>TheSky</w:t>
-      </w:r>
-      <w:proofErr w:type="spellEnd"/>
-      <w:r>
-        <w:rPr>
-          <w:rFonts w:ascii="Arial" w:hAnsi="Arial" w:cs="Arial"/>
-          <w:sz w:val="20"/>
-          <w:szCs w:val="20"/>
-        </w:rPr>
-        <w:t xml:space="preserve"> must be restarted once to load the library structure.</w:t>
+        <w:t xml:space="preserve"> itself.  This utility will parse a directory and subdirectories for reduction files, compile their paths into the folder structure and naming conventions, then directly modify the TheSky configuration file to accept the libraries.  TheSky must be restarted once to load the library structure.</w:t>
       </w:r>
     </w:p>
     <w:p>
@@ -6205,7 +5555,7 @@
 </file>
 
 <file path=word/endnotes.xml><?xml version="1.0" encoding="utf-8"?>
-<w:endnotes xmlns:wpc="http://schemas.microsoft.com/office/word/2010/wordprocessingCanvas" xmlns:cx="http://schemas.microsoft.com/office/drawing/2014/chartex" xmlns:cx1="http://schemas.microsoft.com/office/drawing/2015/9/8/chartex" xmlns:cx2="http://schemas.microsoft.com/office/drawing/2015/10/21/chartex" xmlns:cx3="http://schemas.microsoft.com/office/drawing/2016/5/9/chartex" xmlns:cx4="http://schemas.microsoft.com/office/drawing/2016/5/10/chartex" xmlns:cx5="http://schemas.microsoft.com/office/drawing/2016/5/11/chartex" xmlns:cx6="http://schemas.microsoft.com/office/drawing/2016/5/12/chartex" xmlns:cx7="http://schemas.microsoft.com/office/drawing/2016/5/13/chartex" xmlns:cx8="http://schemas.microsoft.com/office/drawing/2016/5/14/chartex" xmlns:mc="http://schemas.openxmlformats.org/markup-compatibility/2006" xmlns:aink="http://schemas.microsoft.com/office/drawing/2016/ink" xmlns:am3d="http://schemas.microsoft.com/office/drawing/2017/model3d" xmlns:o="urn:schemas-microsoft-com:office:office" xmlns:oel="http://schemas.microsoft.com/office/2019/extlst" xmlns:r="http://schemas.openxmlformats.org/officeDocument/2006/relationships" xmlns:m="http://schemas.openxmlformats.org/officeDocument/2006/math" xmlns:v="urn:schemas-microsoft-com:vml" xmlns:wp14="http://schemas.microsoft.com/office/word/2010/wordprocessingDrawing" xmlns:wp="http://schemas.openxmlformats.org/drawingml/2006/wordprocessingDrawing" xmlns:w10="urn:schemas-microsoft-com:office:word" xmlns:w="http://schemas.openxmlformats.org/wordprocessingml/2006/main" xmlns:w14="http://schemas.microsoft.com/office/word/2010/wordml" xmlns:w15="http://schemas.microsoft.com/office/word/2012/wordml" xmlns:w16cex="http://schemas.microsoft.com/office/word/2018/wordml/cex" xmlns:w16cid="http://schemas.microsoft.com/office/word/2016/wordml/cid" xmlns:w16="http://schemas.microsoft.com/office/word/2018/wordml" xmlns:w16sdtdh="http://schemas.microsoft.com/office/word/2020/wordml/sdtdatahash" xmlns:w16se="http://schemas.microsoft.com/office/word/2015/wordml/symex" xmlns:wpg="http://schemas.microsoft.com/office/word/2010/wordprocessingGroup" xmlns:wpi="http://schemas.microsoft.com/office/word/2010/wordprocessingInk" xmlns:wne="http://schemas.microsoft.com/office/word/2006/wordml" xmlns:wps="http://schemas.microsoft.com/office/word/2010/wordprocessingShape" mc:Ignorable="w14 w15 w16se w16cid w16 w16cex w16sdtdh wp14">
+<w:endnotes xmlns:wpc="http://schemas.microsoft.com/office/word/2010/wordprocessingCanvas" xmlns:cx="http://schemas.microsoft.com/office/drawing/2014/chartex" xmlns:cx1="http://schemas.microsoft.com/office/drawing/2015/9/8/chartex" xmlns:cx2="http://schemas.microsoft.com/office/drawing/2015/10/21/chartex" xmlns:cx3="http://schemas.microsoft.com/office/drawing/2016/5/9/chartex" xmlns:cx4="http://schemas.microsoft.com/office/drawing/2016/5/10/chartex" xmlns:cx5="http://schemas.microsoft.com/office/drawing/2016/5/11/chartex" xmlns:cx6="http://schemas.microsoft.com/office/drawing/2016/5/12/chartex" xmlns:cx7="http://schemas.microsoft.com/office/drawing/2016/5/13/chartex" xmlns:cx8="http://schemas.microsoft.com/office/drawing/2016/5/14/chartex" xmlns:mc="http://schemas.openxmlformats.org/markup-compatibility/2006" xmlns:aink="http://schemas.microsoft.com/office/drawing/2016/ink" xmlns:am3d="http://schemas.microsoft.com/office/drawing/2017/model3d" xmlns:o="urn:schemas-microsoft-com:office:office" xmlns:oel="http://schemas.microsoft.com/office/2019/extlst" xmlns:r="http://schemas.openxmlformats.org/officeDocument/2006/relationships" xmlns:m="http://schemas.openxmlformats.org/officeDocument/2006/math" xmlns:v="urn:schemas-microsoft-com:vml" xmlns:wp14="http://schemas.microsoft.com/office/word/2010/wordprocessingDrawing" xmlns:wp="http://schemas.openxmlformats.org/drawingml/2006/wordprocessingDrawing" xmlns:w10="urn:schemas-microsoft-com:office:word" xmlns:w="http://schemas.openxmlformats.org/wordprocessingml/2006/main" xmlns:w14="http://schemas.microsoft.com/office/word/2010/wordml" xmlns:w15="http://schemas.microsoft.com/office/word/2012/wordml" xmlns:w16cex="http://schemas.microsoft.com/office/word/2018/wordml/cex" xmlns:w16cid="http://schemas.microsoft.com/office/word/2016/wordml/cid" xmlns:w16="http://schemas.microsoft.com/office/word/2018/wordml" xmlns:w16du="http://schemas.microsoft.com/office/word/2023/wordml/word16du" xmlns:w16sdtdh="http://schemas.microsoft.com/office/word/2020/wordml/sdtdatahash" xmlns:w16sdtfl="http://schemas.microsoft.com/office/word/2024/wordml/sdtformatlock" xmlns:w16se="http://schemas.microsoft.com/office/word/2015/wordml/symex" xmlns:wpg="http://schemas.microsoft.com/office/word/2010/wordprocessingGroup" xmlns:wpi="http://schemas.microsoft.com/office/word/2010/wordprocessingInk" xmlns:wne="http://schemas.microsoft.com/office/word/2006/wordml" xmlns:wps="http://schemas.microsoft.com/office/word/2010/wordprocessingShape" mc:Ignorable="w14 w15 w16se w16cid w16 w16cex w16sdtdh w16sdtfl w16du wp14">
   <w:endnote w:type="separator" w:id="-1">
     <w:p>
       <w:pPr>
@@ -6237,7 +5587,7 @@
 </file>
 
 <file path=word/footer1.xml><?xml version="1.0" encoding="utf-8"?>
-<w:ftr xmlns:wpc="http://schemas.microsoft.com/office/word/2010/wordprocessingCanvas" xmlns:cx="http://schemas.microsoft.com/office/drawing/2014/chartex" xmlns:cx1="http://schemas.microsoft.com/office/drawing/2015/9/8/chartex" xmlns:cx2="http://schemas.microsoft.com/office/drawing/2015/10/21/chartex" xmlns:cx3="http://schemas.microsoft.com/office/drawing/2016/5/9/chartex" xmlns:cx4="http://schemas.microsoft.com/office/drawing/2016/5/10/chartex" xmlns:cx5="http://schemas.microsoft.com/office/drawing/2016/5/11/chartex" xmlns:cx6="http://schemas.microsoft.com/office/drawing/2016/5/12/chartex" xmlns:cx7="http://schemas.microsoft.com/office/drawing/2016/5/13/chartex" xmlns:cx8="http://schemas.microsoft.com/office/drawing/2016/5/14/chartex" xmlns:mc="http://schemas.openxmlformats.org/markup-compatibility/2006" xmlns:aink="http://schemas.microsoft.com/office/drawing/2016/ink" xmlns:am3d="http://schemas.microsoft.com/office/drawing/2017/model3d" xmlns:o="urn:schemas-microsoft-com:office:office" xmlns:oel="http://schemas.microsoft.com/office/2019/extlst" xmlns:r="http://schemas.openxmlformats.org/officeDocument/2006/relationships" xmlns:m="http://schemas.openxmlformats.org/officeDocument/2006/math" xmlns:v="urn:schemas-microsoft-com:vml" xmlns:wp14="http://schemas.microsoft.com/office/word/2010/wordprocessingDrawing" xmlns:wp="http://schemas.openxmlformats.org/drawingml/2006/wordprocessingDrawing" xmlns:w10="urn:schemas-microsoft-com:office:word" xmlns:w="http://schemas.openxmlformats.org/wordprocessingml/2006/main" xmlns:w14="http://schemas.microsoft.com/office/word/2010/wordml" xmlns:w15="http://schemas.microsoft.com/office/word/2012/wordml" xmlns:w16cex="http://schemas.microsoft.com/office/word/2018/wordml/cex" xmlns:w16cid="http://schemas.microsoft.com/office/word/2016/wordml/cid" xmlns:w16="http://schemas.microsoft.com/office/word/2018/wordml" xmlns:w16sdtdh="http://schemas.microsoft.com/office/word/2020/wordml/sdtdatahash" xmlns:w16se="http://schemas.microsoft.com/office/word/2015/wordml/symex" xmlns:wpg="http://schemas.microsoft.com/office/word/2010/wordprocessingGroup" xmlns:wpi="http://schemas.microsoft.com/office/word/2010/wordprocessingInk" xmlns:wne="http://schemas.microsoft.com/office/word/2006/wordml" xmlns:wps="http://schemas.microsoft.com/office/word/2010/wordprocessingShape" mc:Ignorable="w14 w15 w16se w16cid w16 w16cex w16sdtdh wp14">
+<w:ftr xmlns:wpc="http://schemas.microsoft.com/office/word/2010/wordprocessingCanvas" xmlns:cx="http://schemas.microsoft.com/office/drawing/2014/chartex" xmlns:cx1="http://schemas.microsoft.com/office/drawing/2015/9/8/chartex" xmlns:cx2="http://schemas.microsoft.com/office/drawing/2015/10/21/chartex" xmlns:cx3="http://schemas.microsoft.com/office/drawing/2016/5/9/chartex" xmlns:cx4="http://schemas.microsoft.com/office/drawing/2016/5/10/chartex" xmlns:cx5="http://schemas.microsoft.com/office/drawing/2016/5/11/chartex" xmlns:cx6="http://schemas.microsoft.com/office/drawing/2016/5/12/chartex" xmlns:cx7="http://schemas.microsoft.com/office/drawing/2016/5/13/chartex" xmlns:cx8="http://schemas.microsoft.com/office/drawing/2016/5/14/chartex" xmlns:mc="http://schemas.openxmlformats.org/markup-compatibility/2006" xmlns:aink="http://schemas.microsoft.com/office/drawing/2016/ink" xmlns:am3d="http://schemas.microsoft.com/office/drawing/2017/model3d" xmlns:o="urn:schemas-microsoft-com:office:office" xmlns:oel="http://schemas.microsoft.com/office/2019/extlst" xmlns:r="http://schemas.openxmlformats.org/officeDocument/2006/relationships" xmlns:m="http://schemas.openxmlformats.org/officeDocument/2006/math" xmlns:v="urn:schemas-microsoft-com:vml" xmlns:wp14="http://schemas.microsoft.com/office/word/2010/wordprocessingDrawing" xmlns:wp="http://schemas.openxmlformats.org/drawingml/2006/wordprocessingDrawing" xmlns:w10="urn:schemas-microsoft-com:office:word" xmlns:w="http://schemas.openxmlformats.org/wordprocessingml/2006/main" xmlns:w14="http://schemas.microsoft.com/office/word/2010/wordml" xmlns:w15="http://schemas.microsoft.com/office/word/2012/wordml" xmlns:w16cex="http://schemas.microsoft.com/office/word/2018/wordml/cex" xmlns:w16cid="http://schemas.microsoft.com/office/word/2016/wordml/cid" xmlns:w16="http://schemas.microsoft.com/office/word/2018/wordml" xmlns:w16du="http://schemas.microsoft.com/office/word/2023/wordml/word16du" xmlns:w16sdtdh="http://schemas.microsoft.com/office/word/2020/wordml/sdtdatahash" xmlns:w16sdtfl="http://schemas.microsoft.com/office/word/2024/wordml/sdtformatlock" xmlns:w16se="http://schemas.microsoft.com/office/word/2015/wordml/symex" xmlns:wpg="http://schemas.microsoft.com/office/word/2010/wordprocessingGroup" xmlns:wpi="http://schemas.microsoft.com/office/word/2010/wordprocessingInk" xmlns:wne="http://schemas.microsoft.com/office/word/2006/wordml" xmlns:wps="http://schemas.microsoft.com/office/word/2010/wordprocessingShape" mc:Ignorable="w14 w15 w16se w16cid w16 w16cex w16sdtdh w16sdtfl w16du wp14">
   <w:p>
     <w:pPr>
       <w:pStyle w:val="Footer"/>
@@ -6300,7 +5650,7 @@
 </file>
 
 <file path=word/footnotes.xml><?xml version="1.0" encoding="utf-8"?>
-<w:footnotes xmlns:wpc="http://schemas.microsoft.com/office/word/2010/wordprocessingCanvas" xmlns:cx="http://schemas.microsoft.com/office/drawing/2014/chartex" xmlns:cx1="http://schemas.microsoft.com/office/drawing/2015/9/8/chartex" xmlns:cx2="http://schemas.microsoft.com/office/drawing/2015/10/21/chartex" xmlns:cx3="http://schemas.microsoft.com/office/drawing/2016/5/9/chartex" xmlns:cx4="http://schemas.microsoft.com/office/drawing/2016/5/10/chartex" xmlns:cx5="http://schemas.microsoft.com/office/drawing/2016/5/11/chartex" xmlns:cx6="http://schemas.microsoft.com/office/drawing/2016/5/12/chartex" xmlns:cx7="http://schemas.microsoft.com/office/drawing/2016/5/13/chartex" xmlns:cx8="http://schemas.microsoft.com/office/drawing/2016/5/14/chartex" xmlns:mc="http://schemas.openxmlformats.org/markup-compatibility/2006" xmlns:aink="http://schemas.microsoft.com/office/drawing/2016/ink" xmlns:am3d="http://schemas.microsoft.com/office/drawing/2017/model3d" xmlns:o="urn:schemas-microsoft-com:office:office" xmlns:oel="http://schemas.microsoft.com/office/2019/extlst" xmlns:r="http://schemas.openxmlformats.org/officeDocument/2006/relationships" xmlns:m="http://schemas.openxmlformats.org/officeDocument/2006/math" xmlns:v="urn:schemas-microsoft-com:vml" xmlns:wp14="http://schemas.microsoft.com/office/word/2010/wordprocessingDrawing" xmlns:wp="http://schemas.openxmlformats.org/drawingml/2006/wordprocessingDrawing" xmlns:w10="urn:schemas-microsoft-com:office:word" xmlns:w="http://schemas.openxmlformats.org/wordprocessingml/2006/main" xmlns:w14="http://schemas.microsoft.com/office/word/2010/wordml" xmlns:w15="http://schemas.microsoft.com/office/word/2012/wordml" xmlns:w16cex="http://schemas.microsoft.com/office/word/2018/wordml/cex" xmlns:w16cid="http://schemas.microsoft.com/office/word/2016/wordml/cid" xmlns:w16="http://schemas.microsoft.com/office/word/2018/wordml" xmlns:w16sdtdh="http://schemas.microsoft.com/office/word/2020/wordml/sdtdatahash" xmlns:w16se="http://schemas.microsoft.com/office/word/2015/wordml/symex" xmlns:wpg="http://schemas.microsoft.com/office/word/2010/wordprocessingGroup" xmlns:wpi="http://schemas.microsoft.com/office/word/2010/wordprocessingInk" xmlns:wne="http://schemas.microsoft.com/office/word/2006/wordml" xmlns:wps="http://schemas.microsoft.com/office/word/2010/wordprocessingShape" mc:Ignorable="w14 w15 w16se w16cid w16 w16cex w16sdtdh wp14">
+<w:footnotes xmlns:wpc="http://schemas.microsoft.com/office/word/2010/wordprocessingCanvas" xmlns:cx="http://schemas.microsoft.com/office/drawing/2014/chartex" xmlns:cx1="http://schemas.microsoft.com/office/drawing/2015/9/8/chartex" xmlns:cx2="http://schemas.microsoft.com/office/drawing/2015/10/21/chartex" xmlns:cx3="http://schemas.microsoft.com/office/drawing/2016/5/9/chartex" xmlns:cx4="http://schemas.microsoft.com/office/drawing/2016/5/10/chartex" xmlns:cx5="http://schemas.microsoft.com/office/drawing/2016/5/11/chartex" xmlns:cx6="http://schemas.microsoft.com/office/drawing/2016/5/12/chartex" xmlns:cx7="http://schemas.microsoft.com/office/drawing/2016/5/13/chartex" xmlns:cx8="http://schemas.microsoft.com/office/drawing/2016/5/14/chartex" xmlns:mc="http://schemas.openxmlformats.org/markup-compatibility/2006" xmlns:aink="http://schemas.microsoft.com/office/drawing/2016/ink" xmlns:am3d="http://schemas.microsoft.com/office/drawing/2017/model3d" xmlns:o="urn:schemas-microsoft-com:office:office" xmlns:oel="http://schemas.microsoft.com/office/2019/extlst" xmlns:r="http://schemas.openxmlformats.org/officeDocument/2006/relationships" xmlns:m="http://schemas.openxmlformats.org/officeDocument/2006/math" xmlns:v="urn:schemas-microsoft-com:vml" xmlns:wp14="http://schemas.microsoft.com/office/word/2010/wordprocessingDrawing" xmlns:wp="http://schemas.openxmlformats.org/drawingml/2006/wordprocessingDrawing" xmlns:w10="urn:schemas-microsoft-com:office:word" xmlns:w="http://schemas.openxmlformats.org/wordprocessingml/2006/main" xmlns:w14="http://schemas.microsoft.com/office/word/2010/wordml" xmlns:w15="http://schemas.microsoft.com/office/word/2012/wordml" xmlns:w16cex="http://schemas.microsoft.com/office/word/2018/wordml/cex" xmlns:w16cid="http://schemas.microsoft.com/office/word/2016/wordml/cid" xmlns:w16="http://schemas.microsoft.com/office/word/2018/wordml" xmlns:w16du="http://schemas.microsoft.com/office/word/2023/wordml/word16du" xmlns:w16sdtdh="http://schemas.microsoft.com/office/word/2020/wordml/sdtdatahash" xmlns:w16sdtfl="http://schemas.microsoft.com/office/word/2024/wordml/sdtformatlock" xmlns:w16se="http://schemas.microsoft.com/office/word/2015/wordml/symex" xmlns:wpg="http://schemas.microsoft.com/office/word/2010/wordprocessingGroup" xmlns:wpi="http://schemas.microsoft.com/office/word/2010/wordprocessingInk" xmlns:wne="http://schemas.microsoft.com/office/word/2006/wordml" xmlns:wps="http://schemas.microsoft.com/office/word/2010/wordprocessingShape" mc:Ignorable="w14 w15 w16se w16cid w16 w16cex w16sdtdh w16sdtfl w16du wp14">
   <w:footnote w:type="separator" w:id="-1">
     <w:p>
       <w:pPr>
@@ -6332,42 +5682,78 @@
 </file>
 
 <file path=word/header1.xml><?xml version="1.0" encoding="utf-8"?>
-<w:hdr xmlns:wpc="http://schemas.microsoft.com/office/word/2010/wordprocessingCanvas" xmlns:cx="http://schemas.microsoft.com/office/drawing/2014/chartex" xmlns:cx1="http://schemas.microsoft.com/office/drawing/2015/9/8/chartex" xmlns:cx2="http://schemas.microsoft.com/office/drawing/2015/10/21/chartex" xmlns:cx3="http://schemas.microsoft.com/office/drawing/2016/5/9/chartex" xmlns:cx4="http://schemas.microsoft.com/office/drawing/2016/5/10/chartex" xmlns:cx5="http://schemas.microsoft.com/office/drawing/2016/5/11/chartex" xmlns:cx6="http://schemas.microsoft.com/office/drawing/2016/5/12/chartex" xmlns:cx7="http://schemas.microsoft.com/office/drawing/2016/5/13/chartex" xmlns:cx8="http://schemas.microsoft.com/office/drawing/2016/5/14/chartex" xmlns:mc="http://schemas.openxmlformats.org/markup-compatibility/2006" xmlns:aink="http://schemas.microsoft.com/office/drawing/2016/ink" xmlns:am3d="http://schemas.microsoft.com/office/drawing/2017/model3d" xmlns:o="urn:schemas-microsoft-com:office:office" xmlns:oel="http://schemas.microsoft.com/office/2019/extlst" xmlns:r="http://schemas.openxmlformats.org/officeDocument/2006/relationships" xmlns:m="http://schemas.openxmlformats.org/officeDocument/2006/math" xmlns:v="urn:schemas-microsoft-com:vml" xmlns:wp14="http://schemas.microsoft.com/office/word/2010/wordprocessingDrawing" xmlns:wp="http://schemas.openxmlformats.org/drawingml/2006/wordprocessingDrawing" xmlns:w10="urn:schemas-microsoft-com:office:word" xmlns:w="http://schemas.openxmlformats.org/wordprocessingml/2006/main" xmlns:w14="http://schemas.microsoft.com/office/word/2010/wordml" xmlns:w15="http://schemas.microsoft.com/office/word/2012/wordml" xmlns:w16cex="http://schemas.microsoft.com/office/word/2018/wordml/cex" xmlns:w16cid="http://schemas.microsoft.com/office/word/2016/wordml/cid" xmlns:w16="http://schemas.microsoft.com/office/word/2018/wordml" xmlns:w16sdtdh="http://schemas.microsoft.com/office/word/2020/wordml/sdtdatahash" xmlns:w16se="http://schemas.microsoft.com/office/word/2015/wordml/symex" xmlns:wpg="http://schemas.microsoft.com/office/word/2010/wordprocessingGroup" xmlns:wpi="http://schemas.microsoft.com/office/word/2010/wordprocessingInk" xmlns:wne="http://schemas.microsoft.com/office/word/2006/wordml" xmlns:wps="http://schemas.microsoft.com/office/word/2010/wordprocessingShape" mc:Ignorable="w14 w15 w16se w16cid w16 w16cex w16sdtdh wp14">
+<w:hdr xmlns:wpc="http://schemas.microsoft.com/office/word/2010/wordprocessingCanvas" xmlns:cx="http://schemas.microsoft.com/office/drawing/2014/chartex" xmlns:cx1="http://schemas.microsoft.com/office/drawing/2015/9/8/chartex" xmlns:cx2="http://schemas.microsoft.com/office/drawing/2015/10/21/chartex" xmlns:cx3="http://schemas.microsoft.com/office/drawing/2016/5/9/chartex" xmlns:cx4="http://schemas.microsoft.com/office/drawing/2016/5/10/chartex" xmlns:cx5="http://schemas.microsoft.com/office/drawing/2016/5/11/chartex" xmlns:cx6="http://schemas.microsoft.com/office/drawing/2016/5/12/chartex" xmlns:cx7="http://schemas.microsoft.com/office/drawing/2016/5/13/chartex" xmlns:cx8="http://schemas.microsoft.com/office/drawing/2016/5/14/chartex" xmlns:mc="http://schemas.openxmlformats.org/markup-compatibility/2006" xmlns:aink="http://schemas.microsoft.com/office/drawing/2016/ink" xmlns:am3d="http://schemas.microsoft.com/office/drawing/2017/model3d" xmlns:o="urn:schemas-microsoft-com:office:office" xmlns:oel="http://schemas.microsoft.com/office/2019/extlst" xmlns:r="http://schemas.openxmlformats.org/officeDocument/2006/relationships" xmlns:m="http://schemas.openxmlformats.org/officeDocument/2006/math" xmlns:v="urn:schemas-microsoft-com:vml" xmlns:wp14="http://schemas.microsoft.com/office/word/2010/wordprocessingDrawing" xmlns:wp="http://schemas.openxmlformats.org/drawingml/2006/wordprocessingDrawing" xmlns:w10="urn:schemas-microsoft-com:office:word" xmlns:w="http://schemas.openxmlformats.org/wordprocessingml/2006/main" xmlns:w14="http://schemas.microsoft.com/office/word/2010/wordml" xmlns:w15="http://schemas.microsoft.com/office/word/2012/wordml" xmlns:w16cex="http://schemas.microsoft.com/office/word/2018/wordml/cex" xmlns:w16cid="http://schemas.microsoft.com/office/word/2016/wordml/cid" xmlns:w16="http://schemas.microsoft.com/office/word/2018/wordml" xmlns:w16du="http://schemas.microsoft.com/office/word/2023/wordml/word16du" xmlns:w16sdtdh="http://schemas.microsoft.com/office/word/2020/wordml/sdtdatahash" xmlns:w16sdtfl="http://schemas.microsoft.com/office/word/2024/wordml/sdtformatlock" xmlns:w16se="http://schemas.microsoft.com/office/word/2015/wordml/symex" xmlns:wpg="http://schemas.microsoft.com/office/word/2010/wordprocessingGroup" xmlns:wpi="http://schemas.microsoft.com/office/word/2010/wordprocessingInk" xmlns:wne="http://schemas.microsoft.com/office/word/2006/wordml" xmlns:wps="http://schemas.microsoft.com/office/word/2010/wordprocessingShape" mc:Ignorable="w14 w15 w16se w16cid w16 w16cex w16sdtdh w16sdtfl w16du wp14">
   <w:p>
     <w:pPr>
       <w:pStyle w:val="Header"/>
+      <w:rPr>
+        <w:lang w:val="fr-FR"/>
+      </w:rPr>
     </w:pPr>
     <w:r>
+      <w:rPr>
+        <w:lang w:val="fr-FR"/>
+      </w:rPr>
       <w:t>Hot Pursuit</w:t>
     </w:r>
     <w:r>
+      <w:rPr>
+        <w:lang w:val="fr-FR"/>
+      </w:rPr>
       <w:t xml:space="preserve"> </w:t>
     </w:r>
     <w:r>
+      <w:rPr>
+        <w:lang w:val="fr-FR"/>
+      </w:rPr>
       <w:t xml:space="preserve">Ver </w:t>
     </w:r>
     <w:r>
+      <w:rPr>
+        <w:lang w:val="fr-FR"/>
+      </w:rPr>
       <w:t>1.0</w:t>
     </w:r>
     <w:r>
+      <w:rPr>
+        <w:lang w:val="fr-FR"/>
+      </w:rPr>
       <w:t>.0</w:t>
     </w:r>
     <w:r>
+      <w:rPr>
+        <w:lang w:val="fr-FR"/>
+      </w:rPr>
       <w:tab/>
     </w:r>
     <w:r>
+      <w:rPr>
+        <w:lang w:val="fr-FR"/>
+      </w:rPr>
       <w:tab/>
     </w:r>
     <w:r>
+      <w:rPr>
+        <w:lang w:val="fr-FR"/>
+      </w:rPr>
       <w:t xml:space="preserve">R. </w:t>
     </w:r>
     <w:r>
+      <w:rPr>
+        <w:lang w:val="fr-FR"/>
+      </w:rPr>
       <w:t xml:space="preserve">McAlister </w:t>
     </w:r>
     <w:r>
+      <w:rPr>
+        <w:lang w:val="fr-FR"/>
+      </w:rPr>
       <w:t>5/12</w:t>
     </w:r>
     <w:r>
+      <w:rPr>
+        <w:lang w:val="fr-FR"/>
+      </w:rPr>
       <w:t>/2021</w:t>
     </w:r>
   </w:p>
@@ -6375,7 +5761,7 @@
 </file>
 
 <file path=word/numbering.xml><?xml version="1.0" encoding="utf-8"?>
-<w:numbering xmlns:wpc="http://schemas.microsoft.com/office/word/2010/wordprocessingCanvas" xmlns:cx="http://schemas.microsoft.com/office/drawing/2014/chartex" xmlns:cx1="http://schemas.microsoft.com/office/drawing/2015/9/8/chartex" xmlns:cx2="http://schemas.microsoft.com/office/drawing/2015/10/21/chartex" xmlns:cx3="http://schemas.microsoft.com/office/drawing/2016/5/9/chartex" xmlns:cx4="http://schemas.microsoft.com/office/drawing/2016/5/10/chartex" xmlns:cx5="http://schemas.microsoft.com/office/drawing/2016/5/11/chartex" xmlns:cx6="http://schemas.microsoft.com/office/drawing/2016/5/12/chartex" xmlns:cx7="http://schemas.microsoft.com/office/drawing/2016/5/13/chartex" xmlns:cx8="http://schemas.microsoft.com/office/drawing/2016/5/14/chartex" xmlns:mc="http://schemas.openxmlformats.org/markup-compatibility/2006" xmlns:aink="http://schemas.microsoft.com/office/drawing/2016/ink" xmlns:am3d="http://schemas.microsoft.com/office/drawing/2017/model3d" xmlns:o="urn:schemas-microsoft-com:office:office" xmlns:oel="http://schemas.microsoft.com/office/2019/extlst" xmlns:r="http://schemas.openxmlformats.org/officeDocument/2006/relationships" xmlns:m="http://schemas.openxmlformats.org/officeDocument/2006/math" xmlns:v="urn:schemas-microsoft-com:vml" xmlns:wp14="http://schemas.microsoft.com/office/word/2010/wordprocessingDrawing" xmlns:wp="http://schemas.openxmlformats.org/drawingml/2006/wordprocessingDrawing" xmlns:w10="urn:schemas-microsoft-com:office:word" xmlns:w="http://schemas.openxmlformats.org/wordprocessingml/2006/main" xmlns:w14="http://schemas.microsoft.com/office/word/2010/wordml" xmlns:w15="http://schemas.microsoft.com/office/word/2012/wordml" xmlns:w16cex="http://schemas.microsoft.com/office/word/2018/wordml/cex" xmlns:w16cid="http://schemas.microsoft.com/office/word/2016/wordml/cid" xmlns:w16="http://schemas.microsoft.com/office/word/2018/wordml" xmlns:w16sdtdh="http://schemas.microsoft.com/office/word/2020/wordml/sdtdatahash" xmlns:w16se="http://schemas.microsoft.com/office/word/2015/wordml/symex" xmlns:wpg="http://schemas.microsoft.com/office/word/2010/wordprocessingGroup" xmlns:wpi="http://schemas.microsoft.com/office/word/2010/wordprocessingInk" xmlns:wne="http://schemas.microsoft.com/office/word/2006/wordml" xmlns:wps="http://schemas.microsoft.com/office/word/2010/wordprocessingShape" mc:Ignorable="w14 w15 w16se w16cid w16 w16cex w16sdtdh wp14">
+<w:numbering xmlns:wpc="http://schemas.microsoft.com/office/word/2010/wordprocessingCanvas" xmlns:cx="http://schemas.microsoft.com/office/drawing/2014/chartex" xmlns:cx1="http://schemas.microsoft.com/office/drawing/2015/9/8/chartex" xmlns:cx2="http://schemas.microsoft.com/office/drawing/2015/10/21/chartex" xmlns:cx3="http://schemas.microsoft.com/office/drawing/2016/5/9/chartex" xmlns:cx4="http://schemas.microsoft.com/office/drawing/2016/5/10/chartex" xmlns:cx5="http://schemas.microsoft.com/office/drawing/2016/5/11/chartex" xmlns:cx6="http://schemas.microsoft.com/office/drawing/2016/5/12/chartex" xmlns:cx7="http://schemas.microsoft.com/office/drawing/2016/5/13/chartex" xmlns:cx8="http://schemas.microsoft.com/office/drawing/2016/5/14/chartex" xmlns:mc="http://schemas.openxmlformats.org/markup-compatibility/2006" xmlns:aink="http://schemas.microsoft.com/office/drawing/2016/ink" xmlns:am3d="http://schemas.microsoft.com/office/drawing/2017/model3d" xmlns:o="urn:schemas-microsoft-com:office:office" xmlns:oel="http://schemas.microsoft.com/office/2019/extlst" xmlns:r="http://schemas.openxmlformats.org/officeDocument/2006/relationships" xmlns:m="http://schemas.openxmlformats.org/officeDocument/2006/math" xmlns:v="urn:schemas-microsoft-com:vml" xmlns:wp14="http://schemas.microsoft.com/office/word/2010/wordprocessingDrawing" xmlns:wp="http://schemas.openxmlformats.org/drawingml/2006/wordprocessingDrawing" xmlns:w10="urn:schemas-microsoft-com:office:word" xmlns:w="http://schemas.openxmlformats.org/wordprocessingml/2006/main" xmlns:w14="http://schemas.microsoft.com/office/word/2010/wordml" xmlns:w15="http://schemas.microsoft.com/office/word/2012/wordml" xmlns:w16cex="http://schemas.microsoft.com/office/word/2018/wordml/cex" xmlns:w16cid="http://schemas.microsoft.com/office/word/2016/wordml/cid" xmlns:w16="http://schemas.microsoft.com/office/word/2018/wordml" xmlns:w16du="http://schemas.microsoft.com/office/word/2023/wordml/word16du" xmlns:w16sdtdh="http://schemas.microsoft.com/office/word/2020/wordml/sdtdatahash" xmlns:w16sdtfl="http://schemas.microsoft.com/office/word/2024/wordml/sdtformatlock" xmlns:w16se="http://schemas.microsoft.com/office/word/2015/wordml/symex" xmlns:wpg="http://schemas.microsoft.com/office/word/2010/wordprocessingGroup" xmlns:wpi="http://schemas.microsoft.com/office/word/2010/wordprocessingInk" xmlns:wne="http://schemas.microsoft.com/office/word/2006/wordml" xmlns:wps="http://schemas.microsoft.com/office/word/2010/wordprocessingShape" mc:Ignorable="w14 w15 w16se w16cid w16 w16cex w16sdtdh w16sdtfl w16du wp14">
   <w:abstractNum w:abstractNumId="0" w15:restartNumberingAfterBreak="0">
     <w:nsid w:val="00A14B62"/>
     <w:multiLevelType w:val="hybridMultilevel"/>
@@ -10297,7 +9683,7 @@
 </file>
 
 <file path=word/styles.xml><?xml version="1.0" encoding="utf-8"?>
-<w:styles xmlns:mc="http://schemas.openxmlformats.org/markup-compatibility/2006" xmlns:r="http://schemas.openxmlformats.org/officeDocument/2006/relationships" xmlns:w="http://schemas.openxmlformats.org/wordprocessingml/2006/main" xmlns:w14="http://schemas.microsoft.com/office/word/2010/wordml" xmlns:w15="http://schemas.microsoft.com/office/word/2012/wordml" xmlns:w16cex="http://schemas.microsoft.com/office/word/2018/wordml/cex" xmlns:w16cid="http://schemas.microsoft.com/office/word/2016/wordml/cid" xmlns:w16="http://schemas.microsoft.com/office/word/2018/wordml" xmlns:w16sdtdh="http://schemas.microsoft.com/office/word/2020/wordml/sdtdatahash" xmlns:w16se="http://schemas.microsoft.com/office/word/2015/wordml/symex" mc:Ignorable="w14 w15 w16se w16cid w16 w16cex w16sdtdh">
+<w:styles xmlns:mc="http://schemas.openxmlformats.org/markup-compatibility/2006" xmlns:r="http://schemas.openxmlformats.org/officeDocument/2006/relationships" xmlns:w="http://schemas.openxmlformats.org/wordprocessingml/2006/main" xmlns:w14="http://schemas.microsoft.com/office/word/2010/wordml" xmlns:w15="http://schemas.microsoft.com/office/word/2012/wordml" xmlns:w16cex="http://schemas.microsoft.com/office/word/2018/wordml/cex" xmlns:w16cid="http://schemas.microsoft.com/office/word/2016/wordml/cid" xmlns:w16="http://schemas.microsoft.com/office/word/2018/wordml" xmlns:w16du="http://schemas.microsoft.com/office/word/2023/wordml/word16du" xmlns:w16sdtdh="http://schemas.microsoft.com/office/word/2020/wordml/sdtdatahash" xmlns:w16sdtfl="http://schemas.microsoft.com/office/word/2024/wordml/sdtformatlock" xmlns:w16se="http://schemas.microsoft.com/office/word/2015/wordml/symex" mc:Ignorable="w14 w15 w16se w16cid w16 w16cex w16sdtdh w16sdtfl w16du">
   <w:docDefaults>
     <w:rPrDefault>
       <w:rPr>

</xml_diff>